<commit_message>
added a quantization matrix to lab2
</commit_message>
<xml_diff>
--- a/lab2/Doc_lab2.docx
+++ b/lab2/Doc_lab2.docx
@@ -147,15 +147,36 @@
       <w:pPr>
         <w:rPr>
           <w:rFonts w:ascii="Times New Roman" w:hAnsi="Times New Roman" w:cs="Times New Roman"/>
-          <w:lang w:val="ru-RU"/>
-        </w:rPr>
-      </w:pPr>
-      <w:r>
-        <w:rPr>
-          <w:rFonts w:ascii="Times New Roman" w:hAnsi="Times New Roman" w:cs="Times New Roman"/>
-          <w:lang w:val="ru-RU"/>
-        </w:rPr>
-        <w:t>- JPEG - формат с потерями, использующий дискретное косинусное преобразование</w:t>
+          <w:lang w:val="ru-BY"/>
+        </w:rPr>
+      </w:pPr>
+      <w:r>
+        <w:rPr>
+          <w:rFonts w:ascii="Times New Roman" w:hAnsi="Times New Roman" w:cs="Times New Roman"/>
+          <w:lang w:val="ru-RU"/>
+        </w:rPr>
+        <w:t xml:space="preserve">- </w:t>
+      </w:r>
+      <w:r>
+        <w:rPr>
+          <w:rFonts w:ascii="Times New Roman" w:hAnsi="Times New Roman" w:cs="Times New Roman"/>
+          <w:lang w:val="ru-BY"/>
+        </w:rPr>
+        <w:t>JPEG - формат с потерями, использующий дискретное косинусное преобразование и</w:t>
+      </w:r>
+      <w:r>
+        <w:rPr>
+          <w:rFonts w:ascii="Times New Roman" w:hAnsi="Times New Roman" w:cs="Times New Roman"/>
+          <w:lang w:val="ru-BY"/>
+        </w:rPr>
+        <w:t xml:space="preserve"> </w:t>
+      </w:r>
+      <w:r>
+        <w:rPr>
+          <w:rFonts w:ascii="Times New Roman" w:hAnsi="Times New Roman" w:cs="Times New Roman"/>
+          <w:lang w:val="ru-BY"/>
+        </w:rPr>
+        <w:t>матрицу квантования для управления степенью сжатия</w:t>
       </w:r>
     </w:p>
     <w:p>
@@ -357,6 +378,35 @@
           <w:lang w:val="ru-RU"/>
         </w:rPr>
       </w:pPr>
+      <w:r>
+        <w:rPr>
+          <w:rFonts w:ascii="Times New Roman" w:hAnsi="Times New Roman" w:cs="Times New Roman"/>
+          <w:lang w:val="ru-RU"/>
+        </w:rPr>
+        <w:t xml:space="preserve">- Матрица квантования (для </w:t>
+      </w:r>
+      <w:r>
+        <w:rPr>
+          <w:rFonts w:ascii="Times New Roman" w:hAnsi="Times New Roman" w:cs="Times New Roman"/>
+          <w:lang w:val="en-US"/>
+        </w:rPr>
+        <w:t>JPEG</w:t>
+      </w:r>
+      <w:r>
+        <w:rPr>
+          <w:rFonts w:ascii="Times New Roman" w:hAnsi="Times New Roman" w:cs="Times New Roman"/>
+          <w:lang w:val="ru-RU"/>
+        </w:rPr>
+        <w:t>-файлов)</w:t>
+      </w:r>
+    </w:p>
+    <w:p>
+      <w:pPr>
+        <w:rPr>
+          <w:rFonts w:ascii="Times New Roman" w:hAnsi="Times New Roman" w:cs="Times New Roman"/>
+          <w:lang w:val="ru-RU"/>
+        </w:rPr>
+      </w:pPr>
     </w:p>
     <w:p>
       <w:pPr>
@@ -434,6 +484,7 @@
           <w:rFonts w:ascii="Times New Roman" w:hAnsi="Times New Roman" w:cs="Times New Roman"/>
           <w:lang w:val="ru-RU"/>
         </w:rPr>
+        <w:lastRenderedPageBreak/>
         <w:t>- Возможность выбора папки для анализа</w:t>
       </w:r>
     </w:p>
@@ -630,6 +681,47 @@
       <w:pPr>
         <w:rPr>
           <w:rFonts w:ascii="Times New Roman" w:hAnsi="Times New Roman" w:cs="Times New Roman"/>
+          <w:lang w:val="ru-BY"/>
+        </w:rPr>
+      </w:pPr>
+      <w:r>
+        <w:rPr>
+          <w:rFonts w:ascii="Times New Roman" w:hAnsi="Times New Roman" w:cs="Times New Roman"/>
+          <w:lang w:val="ru-RU"/>
+        </w:rPr>
+        <w:t>-</w:t>
+      </w:r>
+      <w:r>
+        <w:rPr>
+          <w:rFonts w:ascii="Segoe UI" w:eastAsia="Times New Roman" w:hAnsi="Segoe UI" w:cs="Segoe UI"/>
+          <w:color w:val="F9FAFB"/>
+          <w:kern w:val="0"/>
+          <w:lang w:val="ru-BY" w:eastAsia="ru-BY"/>
+          <w14:ligatures w14:val="none"/>
+        </w:rPr>
+        <w:t xml:space="preserve"> </w:t>
+      </w:r>
+      <w:proofErr w:type="spellStart"/>
+      <w:r>
+        <w:rPr>
+          <w:rFonts w:ascii="Times New Roman" w:hAnsi="Times New Roman" w:cs="Times New Roman"/>
+          <w:lang w:val="ru-BY"/>
+        </w:rPr>
+        <w:t>JpegParser</w:t>
+      </w:r>
+      <w:proofErr w:type="spellEnd"/>
+      <w:r>
+        <w:rPr>
+          <w:rFonts w:ascii="Times New Roman" w:hAnsi="Times New Roman" w:cs="Times New Roman"/>
+          <w:lang w:val="ru-BY"/>
+        </w:rPr>
+        <w:t xml:space="preserve"> - специализированный класс для извлечения данных из JPEG файлов</w:t>
+      </w:r>
+    </w:p>
+    <w:p>
+      <w:pPr>
+        <w:rPr>
+          <w:rFonts w:ascii="Times New Roman" w:hAnsi="Times New Roman" w:cs="Times New Roman"/>
           <w:lang w:val="ru-RU"/>
         </w:rPr>
       </w:pPr>
@@ -895,14 +987,14 @@
       <w:pPr>
         <w:rPr>
           <w:rFonts w:ascii="Times New Roman" w:hAnsi="Times New Roman" w:cs="Times New Roman"/>
-          <w:lang w:val="ru-RU"/>
-        </w:rPr>
-      </w:pPr>
-      <w:proofErr w:type="spellStart"/>
-      <w:r>
-        <w:rPr>
-          <w:rFonts w:ascii="Times New Roman" w:hAnsi="Times New Roman" w:cs="Times New Roman"/>
-          <w:lang w:val="ru-RU"/>
+          <w:lang w:val="en-US"/>
+        </w:rPr>
+      </w:pPr>
+      <w:proofErr w:type="spellStart"/>
+      <w:r>
+        <w:rPr>
+          <w:rFonts w:ascii="Times New Roman" w:hAnsi="Times New Roman" w:cs="Times New Roman"/>
+          <w:lang w:val="en-US"/>
         </w:rPr>
         <w:t>dpiY</w:t>
       </w:r>
@@ -910,7 +1002,7 @@
       <w:r>
         <w:rPr>
           <w:rFonts w:ascii="Times New Roman" w:hAnsi="Times New Roman" w:cs="Times New Roman"/>
-          <w:lang w:val="ru-RU"/>
+          <w:lang w:val="en-US"/>
         </w:rPr>
         <w:t xml:space="preserve"> = </w:t>
       </w:r>
@@ -919,7 +1011,7 @@
       <w:r>
         <w:rPr>
           <w:rFonts w:ascii="Times New Roman" w:hAnsi="Times New Roman" w:cs="Times New Roman"/>
-          <w:lang w:val="ru-RU"/>
+          <w:lang w:val="en-US"/>
         </w:rPr>
         <w:t>image.dotsPerMeterY</w:t>
       </w:r>
@@ -928,7 +1020,7 @@
       <w:r>
         <w:rPr>
           <w:rFonts w:ascii="Times New Roman" w:hAnsi="Times New Roman" w:cs="Times New Roman"/>
-          <w:lang w:val="ru-RU"/>
+          <w:lang w:val="en-US"/>
         </w:rPr>
         <w:t>() * 0.0254;</w:t>
       </w:r>
@@ -937,7 +1029,7 @@
       <w:pPr>
         <w:rPr>
           <w:rFonts w:ascii="Times New Roman" w:hAnsi="Times New Roman" w:cs="Times New Roman"/>
-          <w:lang w:val="ru-RU"/>
+          <w:lang w:val="en-US"/>
         </w:rPr>
       </w:pPr>
     </w:p>
@@ -1168,6 +1260,7 @@
           <w:rFonts w:ascii="Times New Roman" w:hAnsi="Times New Roman" w:cs="Times New Roman"/>
           <w:lang w:val="ru-RU"/>
         </w:rPr>
+        <w:lastRenderedPageBreak/>
         <w:t>Определение типа сжатия:</w:t>
       </w:r>
     </w:p>
@@ -1248,7 +1341,6 @@
           <w:rFonts w:ascii="Times New Roman" w:hAnsi="Times New Roman" w:cs="Times New Roman"/>
           <w:lang w:val="en-US"/>
         </w:rPr>
-        <w:lastRenderedPageBreak/>
         <w:t>if (extension == "jpeg" || extension == "jpg") {</w:t>
       </w:r>
     </w:p>
@@ -1302,28 +1394,63 @@
       <w:pPr>
         <w:rPr>
           <w:rFonts w:ascii="Times New Roman" w:hAnsi="Times New Roman" w:cs="Times New Roman"/>
-          <w:lang w:val="en-US"/>
-        </w:rPr>
-      </w:pPr>
-      <w:r>
-        <w:rPr>
-          <w:rFonts w:ascii="Times New Roman" w:hAnsi="Times New Roman" w:cs="Times New Roman"/>
-          <w:lang w:val="en-US"/>
-        </w:rPr>
-        <w:t xml:space="preserve">    return "PNG (Deflate)";</w:t>
-      </w:r>
-    </w:p>
-    <w:p>
-      <w:pPr>
-        <w:rPr>
-          <w:rFonts w:ascii="Times New Roman" w:hAnsi="Times New Roman" w:cs="Times New Roman"/>
-          <w:lang w:val="en-US"/>
-        </w:rPr>
-      </w:pPr>
-      <w:r>
-        <w:rPr>
-          <w:rFonts w:ascii="Times New Roman" w:hAnsi="Times New Roman" w:cs="Times New Roman"/>
-          <w:lang w:val="en-US"/>
+          <w:lang w:val="ru-RU"/>
+        </w:rPr>
+      </w:pPr>
+      <w:r>
+        <w:rPr>
+          <w:rFonts w:ascii="Times New Roman" w:hAnsi="Times New Roman" w:cs="Times New Roman"/>
+          <w:lang w:val="en-US"/>
+        </w:rPr>
+        <w:t xml:space="preserve">    return</w:t>
+      </w:r>
+      <w:r>
+        <w:rPr>
+          <w:rFonts w:ascii="Times New Roman" w:hAnsi="Times New Roman" w:cs="Times New Roman"/>
+          <w:lang w:val="ru-RU"/>
+        </w:rPr>
+        <w:t xml:space="preserve"> "</w:t>
+      </w:r>
+      <w:r>
+        <w:rPr>
+          <w:rFonts w:ascii="Times New Roman" w:hAnsi="Times New Roman" w:cs="Times New Roman"/>
+          <w:lang w:val="en-US"/>
+        </w:rPr>
+        <w:t>PNG</w:t>
+      </w:r>
+      <w:r>
+        <w:rPr>
+          <w:rFonts w:ascii="Times New Roman" w:hAnsi="Times New Roman" w:cs="Times New Roman"/>
+          <w:lang w:val="ru-RU"/>
+        </w:rPr>
+        <w:t xml:space="preserve"> (</w:t>
+      </w:r>
+      <w:r>
+        <w:rPr>
+          <w:rFonts w:ascii="Times New Roman" w:hAnsi="Times New Roman" w:cs="Times New Roman"/>
+          <w:lang w:val="en-US"/>
+        </w:rPr>
+        <w:t>Deflate</w:t>
+      </w:r>
+      <w:r>
+        <w:rPr>
+          <w:rFonts w:ascii="Times New Roman" w:hAnsi="Times New Roman" w:cs="Times New Roman"/>
+          <w:lang w:val="ru-RU"/>
+        </w:rPr>
+        <w:t>)";</w:t>
+      </w:r>
+    </w:p>
+    <w:p>
+      <w:pPr>
+        <w:rPr>
+          <w:rFonts w:ascii="Times New Roman" w:hAnsi="Times New Roman" w:cs="Times New Roman"/>
+          <w:lang w:val="ru-RU"/>
+        </w:rPr>
+      </w:pPr>
+      <w:r>
+        <w:rPr>
+          <w:rFonts w:ascii="Times New Roman" w:hAnsi="Times New Roman" w:cs="Times New Roman"/>
+          <w:lang w:val="ru-RU"/>
         </w:rPr>
         <w:t>}</w:t>
       </w:r>
@@ -1332,13 +1459,13 @@
       <w:pPr>
         <w:rPr>
           <w:rFonts w:ascii="Times New Roman" w:hAnsi="Times New Roman" w:cs="Times New Roman"/>
-          <w:lang w:val="en-US"/>
-        </w:rPr>
-      </w:pPr>
-      <w:r>
-        <w:rPr>
-          <w:rFonts w:ascii="Times New Roman" w:hAnsi="Times New Roman" w:cs="Times New Roman"/>
-          <w:lang w:val="en-US"/>
+          <w:lang w:val="ru-RU"/>
+        </w:rPr>
+      </w:pPr>
+      <w:r>
+        <w:rPr>
+          <w:rFonts w:ascii="Times New Roman" w:hAnsi="Times New Roman" w:cs="Times New Roman"/>
+          <w:lang w:val="ru-RU"/>
         </w:rPr>
         <w:t xml:space="preserve">// ... </w:t>
       </w:r>
@@ -1352,7 +1479,7 @@
       <w:r>
         <w:rPr>
           <w:rFonts w:ascii="Times New Roman" w:hAnsi="Times New Roman" w:cs="Times New Roman"/>
-          <w:lang w:val="en-US"/>
+          <w:lang w:val="ru-RU"/>
         </w:rPr>
         <w:t xml:space="preserve"> </w:t>
       </w:r>
@@ -1368,7 +1495,7 @@
       <w:pPr>
         <w:rPr>
           <w:rFonts w:ascii="Times New Roman" w:hAnsi="Times New Roman" w:cs="Times New Roman"/>
-          <w:lang w:val="en-US"/>
+          <w:lang w:val="ru-RU"/>
         </w:rPr>
       </w:pPr>
     </w:p>
@@ -1386,24 +1513,1170 @@
           <w:rFonts w:ascii="Times New Roman" w:hAnsi="Times New Roman" w:cs="Times New Roman"/>
           <w:b/>
           <w:bCs/>
-          <w:lang w:val="ru-RU"/>
-        </w:rPr>
-        <w:t>3.3. Особенности реализации интерфейса</w:t>
-      </w:r>
-    </w:p>
-    <w:p>
-      <w:pPr>
-        <w:rPr>
-          <w:rFonts w:ascii="Times New Roman" w:hAnsi="Times New Roman" w:cs="Times New Roman"/>
-          <w:lang w:val="en-US"/>
-        </w:rPr>
-      </w:pPr>
-      <w:r>
-        <w:rPr>
-          <w:rFonts w:ascii="Times New Roman" w:hAnsi="Times New Roman" w:cs="Times New Roman"/>
-          <w:lang w:val="ru-RU"/>
-        </w:rPr>
-        <w:t>Многопоточная обработка:</w:t>
+        </w:rPr>
+        <w:t>3.3. Алгоритм извлечения матрицы квантования для JPEG файлов</w:t>
+      </w:r>
+    </w:p>
+    <w:p>
+      <w:pPr>
+        <w:rPr>
+          <w:rFonts w:ascii="Times New Roman" w:hAnsi="Times New Roman" w:cs="Times New Roman"/>
+          <w:lang w:val="ru-BY"/>
+        </w:rPr>
+      </w:pPr>
+      <w:r>
+        <w:rPr>
+          <w:rFonts w:ascii="Times New Roman" w:hAnsi="Times New Roman" w:cs="Times New Roman"/>
+          <w:lang w:val="ru-BY"/>
+        </w:rPr>
+        <w:t>Для извлечения матрицы квантования из JPEG файлов был реализован специализированный парсер, работающий непосредственно с бинарной структурой файла:</w:t>
+      </w:r>
+    </w:p>
+    <w:p>
+      <w:pPr>
+        <w:rPr>
+          <w:rFonts w:ascii="Times New Roman" w:hAnsi="Times New Roman" w:cs="Times New Roman"/>
+          <w:lang w:val="ru-BY"/>
+        </w:rPr>
+      </w:pPr>
+      <w:r>
+        <w:rPr>
+          <w:rFonts w:ascii="Times New Roman" w:hAnsi="Times New Roman" w:cs="Times New Roman"/>
+          <w:lang w:val="ru-BY"/>
+        </w:rPr>
+        <w:t>// 1. Поиск маркера DQT (</w:t>
+      </w:r>
+      <w:proofErr w:type="spellStart"/>
+      <w:r>
+        <w:rPr>
+          <w:rFonts w:ascii="Times New Roman" w:hAnsi="Times New Roman" w:cs="Times New Roman"/>
+          <w:lang w:val="ru-BY"/>
+        </w:rPr>
+        <w:t>Define</w:t>
+      </w:r>
+      <w:proofErr w:type="spellEnd"/>
+      <w:r>
+        <w:rPr>
+          <w:rFonts w:ascii="Times New Roman" w:hAnsi="Times New Roman" w:cs="Times New Roman"/>
+          <w:lang w:val="ru-BY"/>
+        </w:rPr>
+        <w:t xml:space="preserve"> </w:t>
+      </w:r>
+      <w:proofErr w:type="spellStart"/>
+      <w:r>
+        <w:rPr>
+          <w:rFonts w:ascii="Times New Roman" w:hAnsi="Times New Roman" w:cs="Times New Roman"/>
+          <w:lang w:val="ru-BY"/>
+        </w:rPr>
+        <w:t>Quantization</w:t>
+      </w:r>
+      <w:proofErr w:type="spellEnd"/>
+      <w:r>
+        <w:rPr>
+          <w:rFonts w:ascii="Times New Roman" w:hAnsi="Times New Roman" w:cs="Times New Roman"/>
+          <w:lang w:val="ru-BY"/>
+        </w:rPr>
+        <w:t xml:space="preserve"> </w:t>
+      </w:r>
+      <w:proofErr w:type="spellStart"/>
+      <w:r>
+        <w:rPr>
+          <w:rFonts w:ascii="Times New Roman" w:hAnsi="Times New Roman" w:cs="Times New Roman"/>
+          <w:lang w:val="ru-BY"/>
+        </w:rPr>
+        <w:t>Table</w:t>
+      </w:r>
+      <w:proofErr w:type="spellEnd"/>
+      <w:r>
+        <w:rPr>
+          <w:rFonts w:ascii="Times New Roman" w:hAnsi="Times New Roman" w:cs="Times New Roman"/>
+          <w:lang w:val="ru-BY"/>
+        </w:rPr>
+        <w:t xml:space="preserve"> - 0xFFDB)</w:t>
+      </w:r>
+    </w:p>
+    <w:p>
+      <w:pPr>
+        <w:rPr>
+          <w:rFonts w:ascii="Times New Roman" w:hAnsi="Times New Roman" w:cs="Times New Roman"/>
+          <w:lang w:val="ru-BY"/>
+        </w:rPr>
+      </w:pPr>
+      <w:proofErr w:type="spellStart"/>
+      <w:r>
+        <w:rPr>
+          <w:rFonts w:ascii="Times New Roman" w:hAnsi="Times New Roman" w:cs="Times New Roman"/>
+          <w:lang w:val="ru-BY"/>
+        </w:rPr>
+        <w:t>while</w:t>
+      </w:r>
+      <w:proofErr w:type="spellEnd"/>
+      <w:r>
+        <w:rPr>
+          <w:rFonts w:ascii="Times New Roman" w:hAnsi="Times New Roman" w:cs="Times New Roman"/>
+          <w:lang w:val="ru-BY"/>
+        </w:rPr>
+        <w:t xml:space="preserve"> (!</w:t>
+      </w:r>
+      <w:proofErr w:type="spellStart"/>
+      <w:r>
+        <w:rPr>
+          <w:rFonts w:ascii="Times New Roman" w:hAnsi="Times New Roman" w:cs="Times New Roman"/>
+          <w:lang w:val="ru-BY"/>
+        </w:rPr>
+        <w:t>file.atEnd</w:t>
+      </w:r>
+      <w:proofErr w:type="spellEnd"/>
+      <w:r>
+        <w:rPr>
+          <w:rFonts w:ascii="Times New Roman" w:hAnsi="Times New Roman" w:cs="Times New Roman"/>
+          <w:lang w:val="ru-BY"/>
+        </w:rPr>
+        <w:t>()) {</w:t>
+      </w:r>
+    </w:p>
+    <w:p>
+      <w:pPr>
+        <w:rPr>
+          <w:rFonts w:ascii="Times New Roman" w:hAnsi="Times New Roman" w:cs="Times New Roman"/>
+          <w:lang w:val="ru-BY"/>
+        </w:rPr>
+      </w:pPr>
+      <w:r>
+        <w:rPr>
+          <w:rFonts w:ascii="Times New Roman" w:hAnsi="Times New Roman" w:cs="Times New Roman"/>
+          <w:lang w:val="ru-BY"/>
+        </w:rPr>
+        <w:t xml:space="preserve">    quint16 </w:t>
+      </w:r>
+      <w:proofErr w:type="spellStart"/>
+      <w:r>
+        <w:rPr>
+          <w:rFonts w:ascii="Times New Roman" w:hAnsi="Times New Roman" w:cs="Times New Roman"/>
+          <w:lang w:val="ru-BY"/>
+        </w:rPr>
+        <w:t>marker</w:t>
+      </w:r>
+      <w:proofErr w:type="spellEnd"/>
+      <w:r>
+        <w:rPr>
+          <w:rFonts w:ascii="Times New Roman" w:hAnsi="Times New Roman" w:cs="Times New Roman"/>
+          <w:lang w:val="ru-BY"/>
+        </w:rPr>
+        <w:t xml:space="preserve"> = 0;</w:t>
+      </w:r>
+    </w:p>
+    <w:p>
+      <w:pPr>
+        <w:rPr>
+          <w:rFonts w:ascii="Times New Roman" w:hAnsi="Times New Roman" w:cs="Times New Roman"/>
+          <w:lang w:val="ru-BY"/>
+        </w:rPr>
+      </w:pPr>
+      <w:r>
+        <w:rPr>
+          <w:rFonts w:ascii="Times New Roman" w:hAnsi="Times New Roman" w:cs="Times New Roman"/>
+          <w:lang w:val="ru-BY"/>
+        </w:rPr>
+        <w:t xml:space="preserve">    quint16 </w:t>
+      </w:r>
+      <w:proofErr w:type="spellStart"/>
+      <w:r>
+        <w:rPr>
+          <w:rFonts w:ascii="Times New Roman" w:hAnsi="Times New Roman" w:cs="Times New Roman"/>
+          <w:lang w:val="ru-BY"/>
+        </w:rPr>
+        <w:t>length</w:t>
+      </w:r>
+      <w:proofErr w:type="spellEnd"/>
+      <w:r>
+        <w:rPr>
+          <w:rFonts w:ascii="Times New Roman" w:hAnsi="Times New Roman" w:cs="Times New Roman"/>
+          <w:lang w:val="ru-BY"/>
+        </w:rPr>
+        <w:t xml:space="preserve"> = 0;</w:t>
+      </w:r>
+    </w:p>
+    <w:p>
+      <w:pPr>
+        <w:rPr>
+          <w:rFonts w:ascii="Times New Roman" w:hAnsi="Times New Roman" w:cs="Times New Roman"/>
+          <w:lang w:val="ru-BY"/>
+        </w:rPr>
+      </w:pPr>
+      <w:r>
+        <w:rPr>
+          <w:rFonts w:ascii="Times New Roman" w:hAnsi="Times New Roman" w:cs="Times New Roman"/>
+          <w:lang w:val="ru-BY"/>
+        </w:rPr>
+        <w:t xml:space="preserve">    </w:t>
+      </w:r>
+      <w:proofErr w:type="spellStart"/>
+      <w:r>
+        <w:rPr>
+          <w:rFonts w:ascii="Times New Roman" w:hAnsi="Times New Roman" w:cs="Times New Roman"/>
+          <w:lang w:val="ru-BY"/>
+        </w:rPr>
+        <w:t>if</w:t>
+      </w:r>
+      <w:proofErr w:type="spellEnd"/>
+      <w:r>
+        <w:rPr>
+          <w:rFonts w:ascii="Times New Roman" w:hAnsi="Times New Roman" w:cs="Times New Roman"/>
+          <w:lang w:val="ru-BY"/>
+        </w:rPr>
+        <w:t xml:space="preserve"> (!</w:t>
+      </w:r>
+      <w:proofErr w:type="spellStart"/>
+      <w:r>
+        <w:rPr>
+          <w:rFonts w:ascii="Times New Roman" w:hAnsi="Times New Roman" w:cs="Times New Roman"/>
+          <w:lang w:val="ru-BY"/>
+        </w:rPr>
+        <w:t>readJpegMarker</w:t>
+      </w:r>
+      <w:proofErr w:type="spellEnd"/>
+      <w:r>
+        <w:rPr>
+          <w:rFonts w:ascii="Times New Roman" w:hAnsi="Times New Roman" w:cs="Times New Roman"/>
+          <w:lang w:val="ru-BY"/>
+        </w:rPr>
+        <w:t>(</w:t>
+      </w:r>
+      <w:proofErr w:type="spellStart"/>
+      <w:r>
+        <w:rPr>
+          <w:rFonts w:ascii="Times New Roman" w:hAnsi="Times New Roman" w:cs="Times New Roman"/>
+          <w:lang w:val="ru-BY"/>
+        </w:rPr>
+        <w:t>file</w:t>
+      </w:r>
+      <w:proofErr w:type="spellEnd"/>
+      <w:r>
+        <w:rPr>
+          <w:rFonts w:ascii="Times New Roman" w:hAnsi="Times New Roman" w:cs="Times New Roman"/>
+          <w:lang w:val="ru-BY"/>
+        </w:rPr>
+        <w:t xml:space="preserve">, </w:t>
+      </w:r>
+      <w:proofErr w:type="spellStart"/>
+      <w:r>
+        <w:rPr>
+          <w:rFonts w:ascii="Times New Roman" w:hAnsi="Times New Roman" w:cs="Times New Roman"/>
+          <w:lang w:val="ru-BY"/>
+        </w:rPr>
+        <w:t>marker</w:t>
+      </w:r>
+      <w:proofErr w:type="spellEnd"/>
+      <w:r>
+        <w:rPr>
+          <w:rFonts w:ascii="Times New Roman" w:hAnsi="Times New Roman" w:cs="Times New Roman"/>
+          <w:lang w:val="ru-BY"/>
+        </w:rPr>
+        <w:t xml:space="preserve">, </w:t>
+      </w:r>
+      <w:proofErr w:type="spellStart"/>
+      <w:r>
+        <w:rPr>
+          <w:rFonts w:ascii="Times New Roman" w:hAnsi="Times New Roman" w:cs="Times New Roman"/>
+          <w:lang w:val="ru-BY"/>
+        </w:rPr>
+        <w:t>length</w:t>
+      </w:r>
+      <w:proofErr w:type="spellEnd"/>
+      <w:r>
+        <w:rPr>
+          <w:rFonts w:ascii="Times New Roman" w:hAnsi="Times New Roman" w:cs="Times New Roman"/>
+          <w:lang w:val="ru-BY"/>
+        </w:rPr>
+        <w:t xml:space="preserve">)) </w:t>
+      </w:r>
+      <w:proofErr w:type="spellStart"/>
+      <w:r>
+        <w:rPr>
+          <w:rFonts w:ascii="Times New Roman" w:hAnsi="Times New Roman" w:cs="Times New Roman"/>
+          <w:lang w:val="ru-BY"/>
+        </w:rPr>
+        <w:t>break</w:t>
+      </w:r>
+      <w:proofErr w:type="spellEnd"/>
+      <w:r>
+        <w:rPr>
+          <w:rFonts w:ascii="Times New Roman" w:hAnsi="Times New Roman" w:cs="Times New Roman"/>
+          <w:lang w:val="ru-BY"/>
+        </w:rPr>
+        <w:t>;</w:t>
+      </w:r>
+    </w:p>
+    <w:p>
+      <w:pPr>
+        <w:rPr>
+          <w:rFonts w:ascii="Times New Roman" w:hAnsi="Times New Roman" w:cs="Times New Roman"/>
+          <w:lang w:val="ru-BY"/>
+        </w:rPr>
+      </w:pPr>
+      <w:r>
+        <w:rPr>
+          <w:rFonts w:ascii="Times New Roman" w:hAnsi="Times New Roman" w:cs="Times New Roman"/>
+          <w:lang w:val="ru-BY"/>
+        </w:rPr>
+        <w:t xml:space="preserve">    </w:t>
+      </w:r>
+      <w:proofErr w:type="spellStart"/>
+      <w:r>
+        <w:rPr>
+          <w:rFonts w:ascii="Times New Roman" w:hAnsi="Times New Roman" w:cs="Times New Roman"/>
+          <w:lang w:val="ru-BY"/>
+        </w:rPr>
+        <w:t>if</w:t>
+      </w:r>
+      <w:proofErr w:type="spellEnd"/>
+      <w:r>
+        <w:rPr>
+          <w:rFonts w:ascii="Times New Roman" w:hAnsi="Times New Roman" w:cs="Times New Roman"/>
+          <w:lang w:val="ru-BY"/>
+        </w:rPr>
+        <w:t xml:space="preserve"> (</w:t>
+      </w:r>
+      <w:proofErr w:type="spellStart"/>
+      <w:r>
+        <w:rPr>
+          <w:rFonts w:ascii="Times New Roman" w:hAnsi="Times New Roman" w:cs="Times New Roman"/>
+          <w:lang w:val="ru-BY"/>
+        </w:rPr>
+        <w:t>marker</w:t>
+      </w:r>
+      <w:proofErr w:type="spellEnd"/>
+      <w:r>
+        <w:rPr>
+          <w:rFonts w:ascii="Times New Roman" w:hAnsi="Times New Roman" w:cs="Times New Roman"/>
+          <w:lang w:val="ru-BY"/>
+        </w:rPr>
+        <w:t xml:space="preserve"> == 0xFFDB) { // Маркер таблицы квантования</w:t>
+      </w:r>
+    </w:p>
+    <w:p>
+      <w:pPr>
+        <w:rPr>
+          <w:rFonts w:ascii="Times New Roman" w:hAnsi="Times New Roman" w:cs="Times New Roman"/>
+          <w:lang w:val="ru-BY"/>
+        </w:rPr>
+      </w:pPr>
+      <w:r>
+        <w:rPr>
+          <w:rFonts w:ascii="Times New Roman" w:hAnsi="Times New Roman" w:cs="Times New Roman"/>
+          <w:lang w:val="ru-BY"/>
+        </w:rPr>
+        <w:t xml:space="preserve">        // 2. Извлечение информации о таблице</w:t>
+      </w:r>
+    </w:p>
+    <w:p>
+      <w:pPr>
+        <w:rPr>
+          <w:rFonts w:ascii="Times New Roman" w:hAnsi="Times New Roman" w:cs="Times New Roman"/>
+          <w:lang w:val="ru-BY"/>
+        </w:rPr>
+      </w:pPr>
+      <w:r>
+        <w:rPr>
+          <w:rFonts w:ascii="Times New Roman" w:hAnsi="Times New Roman" w:cs="Times New Roman"/>
+          <w:lang w:val="ru-BY"/>
+        </w:rPr>
+        <w:t xml:space="preserve">        quint8 </w:t>
+      </w:r>
+      <w:proofErr w:type="spellStart"/>
+      <w:r>
+        <w:rPr>
+          <w:rFonts w:ascii="Times New Roman" w:hAnsi="Times New Roman" w:cs="Times New Roman"/>
+          <w:lang w:val="ru-BY"/>
+        </w:rPr>
+        <w:t>tableInfo</w:t>
+      </w:r>
+      <w:proofErr w:type="spellEnd"/>
+      <w:r>
+        <w:rPr>
+          <w:rFonts w:ascii="Times New Roman" w:hAnsi="Times New Roman" w:cs="Times New Roman"/>
+          <w:lang w:val="ru-BY"/>
+        </w:rPr>
+        <w:t>;</w:t>
+      </w:r>
+    </w:p>
+    <w:p>
+      <w:pPr>
+        <w:rPr>
+          <w:rFonts w:ascii="Times New Roman" w:hAnsi="Times New Roman" w:cs="Times New Roman"/>
+          <w:lang w:val="ru-BY"/>
+        </w:rPr>
+      </w:pPr>
+      <w:r>
+        <w:rPr>
+          <w:rFonts w:ascii="Times New Roman" w:hAnsi="Times New Roman" w:cs="Times New Roman"/>
+          <w:lang w:val="ru-BY"/>
+        </w:rPr>
+        <w:t xml:space="preserve">        </w:t>
+      </w:r>
+      <w:proofErr w:type="spellStart"/>
+      <w:r>
+        <w:rPr>
+          <w:rFonts w:ascii="Times New Roman" w:hAnsi="Times New Roman" w:cs="Times New Roman"/>
+          <w:lang w:val="ru-BY"/>
+        </w:rPr>
+        <w:t>int</w:t>
+      </w:r>
+      <w:proofErr w:type="spellEnd"/>
+      <w:r>
+        <w:rPr>
+          <w:rFonts w:ascii="Times New Roman" w:hAnsi="Times New Roman" w:cs="Times New Roman"/>
+          <w:lang w:val="ru-BY"/>
+        </w:rPr>
+        <w:t xml:space="preserve"> </w:t>
+      </w:r>
+      <w:proofErr w:type="spellStart"/>
+      <w:r>
+        <w:rPr>
+          <w:rFonts w:ascii="Times New Roman" w:hAnsi="Times New Roman" w:cs="Times New Roman"/>
+          <w:lang w:val="ru-BY"/>
+        </w:rPr>
+        <w:t>precision</w:t>
+      </w:r>
+      <w:proofErr w:type="spellEnd"/>
+      <w:r>
+        <w:rPr>
+          <w:rFonts w:ascii="Times New Roman" w:hAnsi="Times New Roman" w:cs="Times New Roman"/>
+          <w:lang w:val="ru-BY"/>
+        </w:rPr>
+        <w:t xml:space="preserve"> = (</w:t>
+      </w:r>
+      <w:proofErr w:type="spellStart"/>
+      <w:r>
+        <w:rPr>
+          <w:rFonts w:ascii="Times New Roman" w:hAnsi="Times New Roman" w:cs="Times New Roman"/>
+          <w:lang w:val="ru-BY"/>
+        </w:rPr>
+        <w:t>tableInfo</w:t>
+      </w:r>
+      <w:proofErr w:type="spellEnd"/>
+      <w:r>
+        <w:rPr>
+          <w:rFonts w:ascii="Times New Roman" w:hAnsi="Times New Roman" w:cs="Times New Roman"/>
+          <w:lang w:val="ru-BY"/>
+        </w:rPr>
+        <w:t xml:space="preserve"> &gt;&gt; 4) &amp; 0x0F;  // Точность: 0=8 бит, 1=16 бит</w:t>
+      </w:r>
+    </w:p>
+    <w:p>
+      <w:pPr>
+        <w:rPr>
+          <w:rFonts w:ascii="Times New Roman" w:hAnsi="Times New Roman" w:cs="Times New Roman"/>
+          <w:lang w:val="ru-BY"/>
+        </w:rPr>
+      </w:pPr>
+      <w:r>
+        <w:rPr>
+          <w:rFonts w:ascii="Times New Roman" w:hAnsi="Times New Roman" w:cs="Times New Roman"/>
+          <w:lang w:val="ru-BY"/>
+        </w:rPr>
+        <w:t xml:space="preserve">        </w:t>
+      </w:r>
+      <w:proofErr w:type="spellStart"/>
+      <w:r>
+        <w:rPr>
+          <w:rFonts w:ascii="Times New Roman" w:hAnsi="Times New Roman" w:cs="Times New Roman"/>
+          <w:lang w:val="ru-BY"/>
+        </w:rPr>
+        <w:t>int</w:t>
+      </w:r>
+      <w:proofErr w:type="spellEnd"/>
+      <w:r>
+        <w:rPr>
+          <w:rFonts w:ascii="Times New Roman" w:hAnsi="Times New Roman" w:cs="Times New Roman"/>
+          <w:lang w:val="ru-BY"/>
+        </w:rPr>
+        <w:t xml:space="preserve"> </w:t>
+      </w:r>
+      <w:proofErr w:type="spellStart"/>
+      <w:r>
+        <w:rPr>
+          <w:rFonts w:ascii="Times New Roman" w:hAnsi="Times New Roman" w:cs="Times New Roman"/>
+          <w:lang w:val="ru-BY"/>
+        </w:rPr>
+        <w:t>destination</w:t>
+      </w:r>
+      <w:proofErr w:type="spellEnd"/>
+      <w:r>
+        <w:rPr>
+          <w:rFonts w:ascii="Times New Roman" w:hAnsi="Times New Roman" w:cs="Times New Roman"/>
+          <w:lang w:val="ru-BY"/>
+        </w:rPr>
+        <w:t xml:space="preserve"> = </w:t>
+      </w:r>
+      <w:proofErr w:type="spellStart"/>
+      <w:r>
+        <w:rPr>
+          <w:rFonts w:ascii="Times New Roman" w:hAnsi="Times New Roman" w:cs="Times New Roman"/>
+          <w:lang w:val="ru-BY"/>
+        </w:rPr>
+        <w:t>tableInfo</w:t>
+      </w:r>
+      <w:proofErr w:type="spellEnd"/>
+      <w:r>
+        <w:rPr>
+          <w:rFonts w:ascii="Times New Roman" w:hAnsi="Times New Roman" w:cs="Times New Roman"/>
+          <w:lang w:val="ru-BY"/>
+        </w:rPr>
+        <w:t xml:space="preserve"> &amp; 0x0F;       // Назначение: 0=Y, 1=</w:t>
+      </w:r>
+      <w:proofErr w:type="spellStart"/>
+      <w:r>
+        <w:rPr>
+          <w:rFonts w:ascii="Times New Roman" w:hAnsi="Times New Roman" w:cs="Times New Roman"/>
+          <w:lang w:val="ru-BY"/>
+        </w:rPr>
+        <w:t>Cb</w:t>
+      </w:r>
+      <w:proofErr w:type="spellEnd"/>
+      <w:r>
+        <w:rPr>
+          <w:rFonts w:ascii="Times New Roman" w:hAnsi="Times New Roman" w:cs="Times New Roman"/>
+          <w:lang w:val="ru-BY"/>
+        </w:rPr>
+        <w:t>, 2=</w:t>
+      </w:r>
+      <w:proofErr w:type="spellStart"/>
+      <w:r>
+        <w:rPr>
+          <w:rFonts w:ascii="Times New Roman" w:hAnsi="Times New Roman" w:cs="Times New Roman"/>
+          <w:lang w:val="ru-BY"/>
+        </w:rPr>
+        <w:t>Cr</w:t>
+      </w:r>
+      <w:proofErr w:type="spellEnd"/>
+    </w:p>
+    <w:p>
+      <w:pPr>
+        <w:rPr>
+          <w:rFonts w:ascii="Times New Roman" w:hAnsi="Times New Roman" w:cs="Times New Roman"/>
+          <w:lang w:val="ru-BY"/>
+        </w:rPr>
+      </w:pPr>
+      <w:r>
+        <w:rPr>
+          <w:rFonts w:ascii="Times New Roman" w:hAnsi="Times New Roman" w:cs="Times New Roman"/>
+          <w:lang w:val="ru-BY"/>
+        </w:rPr>
+        <w:t xml:space="preserve">        // 3. Парсинг матрицы 8x8</w:t>
+      </w:r>
+    </w:p>
+    <w:p>
+      <w:pPr>
+        <w:rPr>
+          <w:rFonts w:ascii="Times New Roman" w:hAnsi="Times New Roman" w:cs="Times New Roman"/>
+          <w:lang w:val="ru-BY"/>
+        </w:rPr>
+      </w:pPr>
+      <w:r>
+        <w:rPr>
+          <w:rFonts w:ascii="Times New Roman" w:hAnsi="Times New Roman" w:cs="Times New Roman"/>
+          <w:lang w:val="ru-BY"/>
+        </w:rPr>
+        <w:t xml:space="preserve">        </w:t>
+      </w:r>
+      <w:proofErr w:type="spellStart"/>
+      <w:r>
+        <w:rPr>
+          <w:rFonts w:ascii="Times New Roman" w:hAnsi="Times New Roman" w:cs="Times New Roman"/>
+          <w:lang w:val="ru-BY"/>
+        </w:rPr>
+        <w:t>QuantizationTable</w:t>
+      </w:r>
+      <w:proofErr w:type="spellEnd"/>
+      <w:r>
+        <w:rPr>
+          <w:rFonts w:ascii="Times New Roman" w:hAnsi="Times New Roman" w:cs="Times New Roman"/>
+          <w:lang w:val="ru-BY"/>
+        </w:rPr>
+        <w:t xml:space="preserve"> </w:t>
+      </w:r>
+      <w:proofErr w:type="spellStart"/>
+      <w:r>
+        <w:rPr>
+          <w:rFonts w:ascii="Times New Roman" w:hAnsi="Times New Roman" w:cs="Times New Roman"/>
+          <w:lang w:val="ru-BY"/>
+        </w:rPr>
+        <w:t>qt</w:t>
+      </w:r>
+      <w:proofErr w:type="spellEnd"/>
+      <w:r>
+        <w:rPr>
+          <w:rFonts w:ascii="Times New Roman" w:hAnsi="Times New Roman" w:cs="Times New Roman"/>
+          <w:lang w:val="ru-BY"/>
+        </w:rPr>
+        <w:t>;</w:t>
+      </w:r>
+    </w:p>
+    <w:p>
+      <w:pPr>
+        <w:rPr>
+          <w:rFonts w:ascii="Times New Roman" w:hAnsi="Times New Roman" w:cs="Times New Roman"/>
+          <w:lang w:val="ru-BY"/>
+        </w:rPr>
+      </w:pPr>
+      <w:r>
+        <w:rPr>
+          <w:rFonts w:ascii="Times New Roman" w:hAnsi="Times New Roman" w:cs="Times New Roman"/>
+          <w:lang w:val="ru-BY"/>
+        </w:rPr>
+        <w:t xml:space="preserve">        </w:t>
+      </w:r>
+      <w:proofErr w:type="spellStart"/>
+      <w:r>
+        <w:rPr>
+          <w:rFonts w:ascii="Times New Roman" w:hAnsi="Times New Roman" w:cs="Times New Roman"/>
+          <w:lang w:val="ru-BY"/>
+        </w:rPr>
+        <w:t>qt.precision</w:t>
+      </w:r>
+      <w:proofErr w:type="spellEnd"/>
+      <w:r>
+        <w:rPr>
+          <w:rFonts w:ascii="Times New Roman" w:hAnsi="Times New Roman" w:cs="Times New Roman"/>
+          <w:lang w:val="ru-BY"/>
+        </w:rPr>
+        <w:t xml:space="preserve"> = </w:t>
+      </w:r>
+      <w:proofErr w:type="spellStart"/>
+      <w:r>
+        <w:rPr>
+          <w:rFonts w:ascii="Times New Roman" w:hAnsi="Times New Roman" w:cs="Times New Roman"/>
+          <w:lang w:val="ru-BY"/>
+        </w:rPr>
+        <w:t>precision</w:t>
+      </w:r>
+      <w:proofErr w:type="spellEnd"/>
+      <w:r>
+        <w:rPr>
+          <w:rFonts w:ascii="Times New Roman" w:hAnsi="Times New Roman" w:cs="Times New Roman"/>
+          <w:lang w:val="ru-BY"/>
+        </w:rPr>
+        <w:t>;</w:t>
+      </w:r>
+    </w:p>
+    <w:p>
+      <w:pPr>
+        <w:rPr>
+          <w:rFonts w:ascii="Times New Roman" w:hAnsi="Times New Roman" w:cs="Times New Roman"/>
+          <w:lang w:val="ru-BY"/>
+        </w:rPr>
+      </w:pPr>
+      <w:r>
+        <w:rPr>
+          <w:rFonts w:ascii="Times New Roman" w:hAnsi="Times New Roman" w:cs="Times New Roman"/>
+          <w:lang w:val="ru-BY"/>
+        </w:rPr>
+        <w:t xml:space="preserve">        </w:t>
+      </w:r>
+      <w:proofErr w:type="spellStart"/>
+      <w:r>
+        <w:rPr>
+          <w:rFonts w:ascii="Times New Roman" w:hAnsi="Times New Roman" w:cs="Times New Roman"/>
+          <w:lang w:val="ru-BY"/>
+        </w:rPr>
+        <w:t>qt.destination</w:t>
+      </w:r>
+      <w:proofErr w:type="spellEnd"/>
+      <w:r>
+        <w:rPr>
+          <w:rFonts w:ascii="Times New Roman" w:hAnsi="Times New Roman" w:cs="Times New Roman"/>
+          <w:lang w:val="ru-BY"/>
+        </w:rPr>
+        <w:t xml:space="preserve"> = </w:t>
+      </w:r>
+      <w:proofErr w:type="spellStart"/>
+      <w:r>
+        <w:rPr>
+          <w:rFonts w:ascii="Times New Roman" w:hAnsi="Times New Roman" w:cs="Times New Roman"/>
+          <w:lang w:val="ru-BY"/>
+        </w:rPr>
+        <w:t>destination</w:t>
+      </w:r>
+      <w:proofErr w:type="spellEnd"/>
+      <w:r>
+        <w:rPr>
+          <w:rFonts w:ascii="Times New Roman" w:hAnsi="Times New Roman" w:cs="Times New Roman"/>
+          <w:lang w:val="ru-BY"/>
+        </w:rPr>
+        <w:t>;</w:t>
+      </w:r>
+    </w:p>
+    <w:p>
+      <w:pPr>
+        <w:rPr>
+          <w:rFonts w:ascii="Times New Roman" w:hAnsi="Times New Roman" w:cs="Times New Roman"/>
+          <w:lang w:val="ru-BY"/>
+        </w:rPr>
+      </w:pPr>
+      <w:r>
+        <w:rPr>
+          <w:rFonts w:ascii="Times New Roman" w:hAnsi="Times New Roman" w:cs="Times New Roman"/>
+          <w:lang w:val="ru-BY"/>
+        </w:rPr>
+        <w:t xml:space="preserve">        </w:t>
+      </w:r>
+      <w:proofErr w:type="spellStart"/>
+      <w:r>
+        <w:rPr>
+          <w:rFonts w:ascii="Times New Roman" w:hAnsi="Times New Roman" w:cs="Times New Roman"/>
+          <w:lang w:val="ru-BY"/>
+        </w:rPr>
+        <w:t>qt.table</w:t>
+      </w:r>
+      <w:proofErr w:type="spellEnd"/>
+      <w:r>
+        <w:rPr>
+          <w:rFonts w:ascii="Times New Roman" w:hAnsi="Times New Roman" w:cs="Times New Roman"/>
+          <w:lang w:val="ru-BY"/>
+        </w:rPr>
+        <w:t xml:space="preserve"> = </w:t>
+      </w:r>
+      <w:proofErr w:type="spellStart"/>
+      <w:r>
+        <w:rPr>
+          <w:rFonts w:ascii="Times New Roman" w:hAnsi="Times New Roman" w:cs="Times New Roman"/>
+          <w:lang w:val="ru-BY"/>
+        </w:rPr>
+        <w:t>parseQuantizationTable</w:t>
+      </w:r>
+      <w:proofErr w:type="spellEnd"/>
+      <w:r>
+        <w:rPr>
+          <w:rFonts w:ascii="Times New Roman" w:hAnsi="Times New Roman" w:cs="Times New Roman"/>
+          <w:lang w:val="ru-BY"/>
+        </w:rPr>
+        <w:t>(</w:t>
+      </w:r>
+      <w:proofErr w:type="spellStart"/>
+      <w:r>
+        <w:rPr>
+          <w:rFonts w:ascii="Times New Roman" w:hAnsi="Times New Roman" w:cs="Times New Roman"/>
+          <w:lang w:val="ru-BY"/>
+        </w:rPr>
+        <w:t>file</w:t>
+      </w:r>
+      <w:proofErr w:type="spellEnd"/>
+      <w:r>
+        <w:rPr>
+          <w:rFonts w:ascii="Times New Roman" w:hAnsi="Times New Roman" w:cs="Times New Roman"/>
+          <w:lang w:val="ru-BY"/>
+        </w:rPr>
+        <w:t xml:space="preserve">, </w:t>
+      </w:r>
+      <w:proofErr w:type="spellStart"/>
+      <w:r>
+        <w:rPr>
+          <w:rFonts w:ascii="Times New Roman" w:hAnsi="Times New Roman" w:cs="Times New Roman"/>
+          <w:lang w:val="ru-BY"/>
+        </w:rPr>
+        <w:t>precision</w:t>
+      </w:r>
+      <w:proofErr w:type="spellEnd"/>
+      <w:r>
+        <w:rPr>
+          <w:rFonts w:ascii="Times New Roman" w:hAnsi="Times New Roman" w:cs="Times New Roman"/>
+          <w:lang w:val="ru-BY"/>
+        </w:rPr>
+        <w:t>);</w:t>
+      </w:r>
+    </w:p>
+    <w:p>
+      <w:pPr>
+        <w:rPr>
+          <w:rFonts w:ascii="Times New Roman" w:hAnsi="Times New Roman" w:cs="Times New Roman"/>
+          <w:lang w:val="ru-BY"/>
+        </w:rPr>
+      </w:pPr>
+      <w:r>
+        <w:rPr>
+          <w:rFonts w:ascii="Times New Roman" w:hAnsi="Times New Roman" w:cs="Times New Roman"/>
+          <w:lang w:val="ru-BY"/>
+        </w:rPr>
+        <w:t xml:space="preserve">        </w:t>
+      </w:r>
+      <w:proofErr w:type="spellStart"/>
+      <w:r>
+        <w:rPr>
+          <w:rFonts w:ascii="Times New Roman" w:hAnsi="Times New Roman" w:cs="Times New Roman"/>
+          <w:lang w:val="ru-BY"/>
+        </w:rPr>
+        <w:t>tables.append</w:t>
+      </w:r>
+      <w:proofErr w:type="spellEnd"/>
+      <w:r>
+        <w:rPr>
+          <w:rFonts w:ascii="Times New Roman" w:hAnsi="Times New Roman" w:cs="Times New Roman"/>
+          <w:lang w:val="ru-BY"/>
+        </w:rPr>
+        <w:t>(</w:t>
+      </w:r>
+      <w:proofErr w:type="spellStart"/>
+      <w:r>
+        <w:rPr>
+          <w:rFonts w:ascii="Times New Roman" w:hAnsi="Times New Roman" w:cs="Times New Roman"/>
+          <w:lang w:val="ru-BY"/>
+        </w:rPr>
+        <w:t>qt</w:t>
+      </w:r>
+      <w:proofErr w:type="spellEnd"/>
+      <w:r>
+        <w:rPr>
+          <w:rFonts w:ascii="Times New Roman" w:hAnsi="Times New Roman" w:cs="Times New Roman"/>
+          <w:lang w:val="ru-BY"/>
+        </w:rPr>
+        <w:t>);</w:t>
+      </w:r>
+    </w:p>
+    <w:p>
+      <w:pPr>
+        <w:rPr>
+          <w:rFonts w:ascii="Times New Roman" w:hAnsi="Times New Roman" w:cs="Times New Roman"/>
+          <w:lang w:val="ru-BY"/>
+        </w:rPr>
+      </w:pPr>
+      <w:r>
+        <w:rPr>
+          <w:rFonts w:ascii="Times New Roman" w:hAnsi="Times New Roman" w:cs="Times New Roman"/>
+          <w:lang w:val="ru-BY"/>
+        </w:rPr>
+        <w:t xml:space="preserve">    }</w:t>
+      </w:r>
+    </w:p>
+    <w:p>
+      <w:pPr>
+        <w:rPr>
+          <w:rFonts w:ascii="Times New Roman" w:hAnsi="Times New Roman" w:cs="Times New Roman"/>
+          <w:lang w:val="ru-BY"/>
+        </w:rPr>
+      </w:pPr>
+      <w:r>
+        <w:rPr>
+          <w:rFonts w:ascii="Times New Roman" w:hAnsi="Times New Roman" w:cs="Times New Roman"/>
+          <w:lang w:val="ru-BY"/>
+        </w:rPr>
+        <w:t>}</w:t>
+      </w:r>
+    </w:p>
+    <w:p>
+      <w:pPr>
+        <w:rPr>
+          <w:rFonts w:ascii="Times New Roman" w:hAnsi="Times New Roman" w:cs="Times New Roman"/>
+          <w:lang w:val="ru-BY"/>
+        </w:rPr>
+      </w:pPr>
+    </w:p>
+    <w:p>
+      <w:pPr>
+        <w:rPr>
+          <w:rFonts w:ascii="Times New Roman" w:hAnsi="Times New Roman" w:cs="Times New Roman"/>
+          <w:lang w:val="ru-BY"/>
+        </w:rPr>
+      </w:pPr>
+      <w:r>
+        <w:rPr>
+          <w:rFonts w:ascii="Times New Roman" w:hAnsi="Times New Roman" w:cs="Times New Roman"/>
+          <w:b/>
+          <w:bCs/>
+          <w:lang w:val="ru-BY"/>
+        </w:rPr>
+        <w:lastRenderedPageBreak/>
+        <w:t>3.4. Роль матрицы квантования в алгоритме JPEG</w:t>
+      </w:r>
+    </w:p>
+    <w:p>
+      <w:pPr>
+        <w:rPr>
+          <w:rFonts w:ascii="Times New Roman" w:hAnsi="Times New Roman" w:cs="Times New Roman"/>
+          <w:lang w:val="ru-BY"/>
+        </w:rPr>
+      </w:pPr>
+      <w:r>
+        <w:rPr>
+          <w:rFonts w:ascii="Times New Roman" w:hAnsi="Times New Roman" w:cs="Times New Roman"/>
+          <w:lang w:val="ru-BY"/>
+        </w:rPr>
+        <w:t>Матрица квантования является ключевым компонентом алгоритма сжатия JPEG, определяющим качество и степень сжатия изображения. В процессе кодирования JPEG:</w:t>
+      </w:r>
+    </w:p>
+    <w:p>
+      <w:pPr>
+        <w:numPr>
+          <w:ilvl w:val="0"/>
+          <w:numId w:val="4"/>
+        </w:numPr>
+        <w:tabs>
+          <w:tab w:val="clear" w:pos="720"/>
+          <w:tab w:val="num" w:pos="360"/>
+        </w:tabs>
+        <w:ind w:left="360"/>
+        <w:rPr>
+          <w:rFonts w:ascii="Times New Roman" w:hAnsi="Times New Roman" w:cs="Times New Roman"/>
+          <w:lang w:val="ru-BY"/>
+        </w:rPr>
+      </w:pPr>
+      <w:r>
+        <w:rPr>
+          <w:rFonts w:ascii="Times New Roman" w:hAnsi="Times New Roman" w:cs="Times New Roman"/>
+          <w:lang w:val="ru-BY"/>
+        </w:rPr>
+        <w:t>Изображение разбивается на блоки 8×8 пикселей</w:t>
+      </w:r>
+    </w:p>
+    <w:p>
+      <w:pPr>
+        <w:numPr>
+          <w:ilvl w:val="0"/>
+          <w:numId w:val="4"/>
+        </w:numPr>
+        <w:tabs>
+          <w:tab w:val="clear" w:pos="720"/>
+          <w:tab w:val="num" w:pos="360"/>
+        </w:tabs>
+        <w:ind w:left="360"/>
+        <w:rPr>
+          <w:rFonts w:ascii="Times New Roman" w:hAnsi="Times New Roman" w:cs="Times New Roman"/>
+          <w:lang w:val="ru-BY"/>
+        </w:rPr>
+      </w:pPr>
+      <w:r>
+        <w:rPr>
+          <w:rFonts w:ascii="Times New Roman" w:hAnsi="Times New Roman" w:cs="Times New Roman"/>
+          <w:lang w:val="ru-BY"/>
+        </w:rPr>
+        <w:t>К каждому блоку применяется Дискретное Косинусное Преобразование (ДКП)</w:t>
+      </w:r>
+    </w:p>
+    <w:p>
+      <w:pPr>
+        <w:numPr>
+          <w:ilvl w:val="0"/>
+          <w:numId w:val="4"/>
+        </w:numPr>
+        <w:tabs>
+          <w:tab w:val="clear" w:pos="720"/>
+          <w:tab w:val="num" w:pos="360"/>
+        </w:tabs>
+        <w:ind w:left="360"/>
+        <w:rPr>
+          <w:rFonts w:ascii="Times New Roman" w:hAnsi="Times New Roman" w:cs="Times New Roman"/>
+          <w:lang w:val="ru-BY"/>
+        </w:rPr>
+      </w:pPr>
+      <w:r>
+        <w:rPr>
+          <w:rFonts w:ascii="Times New Roman" w:hAnsi="Times New Roman" w:cs="Times New Roman"/>
+          <w:lang w:val="ru-BY"/>
+        </w:rPr>
+        <w:t>Полученные коэффициенты ДКП делятся на соответствующие значения из матрицы квантования и округляются:</w:t>
+      </w:r>
+    </w:p>
+    <w:p>
+      <w:pPr>
+        <w:ind w:left="-360" w:firstLine="360"/>
+        <w:rPr>
+          <w:rFonts w:ascii="Times New Roman" w:hAnsi="Times New Roman" w:cs="Times New Roman"/>
+          <w:lang w:val="ru-BY"/>
+        </w:rPr>
+      </w:pPr>
+      <w:proofErr w:type="spellStart"/>
+      <w:r>
+        <w:rPr>
+          <w:rFonts w:ascii="Times New Roman" w:hAnsi="Times New Roman" w:cs="Times New Roman"/>
+          <w:lang w:val="ru-BY"/>
+        </w:rPr>
+        <w:t>quantized_value</w:t>
+      </w:r>
+      <w:proofErr w:type="spellEnd"/>
+      <w:r>
+        <w:rPr>
+          <w:rFonts w:ascii="Times New Roman" w:hAnsi="Times New Roman" w:cs="Times New Roman"/>
+          <w:lang w:val="ru-BY"/>
+        </w:rPr>
+        <w:t xml:space="preserve"> = </w:t>
+      </w:r>
+      <w:proofErr w:type="spellStart"/>
+      <w:r>
+        <w:rPr>
+          <w:rFonts w:ascii="Times New Roman" w:hAnsi="Times New Roman" w:cs="Times New Roman"/>
+          <w:lang w:val="ru-BY"/>
+        </w:rPr>
+        <w:t>round</w:t>
+      </w:r>
+      <w:proofErr w:type="spellEnd"/>
+      <w:r>
+        <w:rPr>
+          <w:rFonts w:ascii="Times New Roman" w:hAnsi="Times New Roman" w:cs="Times New Roman"/>
+          <w:lang w:val="ru-BY"/>
+        </w:rPr>
+        <w:t>(</w:t>
+      </w:r>
+      <w:proofErr w:type="spellStart"/>
+      <w:r>
+        <w:rPr>
+          <w:rFonts w:ascii="Times New Roman" w:hAnsi="Times New Roman" w:cs="Times New Roman"/>
+          <w:lang w:val="ru-BY"/>
+        </w:rPr>
+        <w:t>DCT_coefficient</w:t>
+      </w:r>
+      <w:proofErr w:type="spellEnd"/>
+      <w:r>
+        <w:rPr>
+          <w:rFonts w:ascii="Times New Roman" w:hAnsi="Times New Roman" w:cs="Times New Roman"/>
+          <w:lang w:val="ru-BY"/>
+        </w:rPr>
+        <w:t xml:space="preserve"> / </w:t>
+      </w:r>
+      <w:proofErr w:type="spellStart"/>
+      <w:r>
+        <w:rPr>
+          <w:rFonts w:ascii="Times New Roman" w:hAnsi="Times New Roman" w:cs="Times New Roman"/>
+          <w:lang w:val="ru-BY"/>
+        </w:rPr>
+        <w:t>quantization_matrix_value</w:t>
+      </w:r>
+      <w:proofErr w:type="spellEnd"/>
+      <w:r>
+        <w:rPr>
+          <w:rFonts w:ascii="Times New Roman" w:hAnsi="Times New Roman" w:cs="Times New Roman"/>
+          <w:lang w:val="ru-BY"/>
+        </w:rPr>
+        <w:t>);</w:t>
+      </w:r>
+    </w:p>
+    <w:p>
+      <w:pPr>
+        <w:numPr>
+          <w:ilvl w:val="0"/>
+          <w:numId w:val="4"/>
+        </w:numPr>
+        <w:tabs>
+          <w:tab w:val="clear" w:pos="720"/>
+          <w:tab w:val="num" w:pos="360"/>
+        </w:tabs>
+        <w:ind w:left="360"/>
+        <w:rPr>
+          <w:rFonts w:ascii="Times New Roman" w:hAnsi="Times New Roman" w:cs="Times New Roman"/>
+          <w:lang w:val="ru-BY"/>
+        </w:rPr>
+      </w:pPr>
+      <w:r>
+        <w:rPr>
+          <w:rFonts w:ascii="Times New Roman" w:hAnsi="Times New Roman" w:cs="Times New Roman"/>
+          <w:lang w:val="ru-BY"/>
+        </w:rPr>
+        <w:t>Меньшие значения в матрице (обычно в левом верхнем углу) соответствуют более важным низкочастотным компонентам и обеспечивают меньшее сжатие</w:t>
+      </w:r>
+    </w:p>
+    <w:p>
+      <w:pPr>
+        <w:numPr>
+          <w:ilvl w:val="0"/>
+          <w:numId w:val="4"/>
+        </w:numPr>
+        <w:tabs>
+          <w:tab w:val="clear" w:pos="720"/>
+          <w:tab w:val="num" w:pos="360"/>
+        </w:tabs>
+        <w:ind w:left="360"/>
+        <w:rPr>
+          <w:rFonts w:ascii="Times New Roman" w:hAnsi="Times New Roman" w:cs="Times New Roman"/>
+          <w:lang w:val="ru-BY"/>
+        </w:rPr>
+      </w:pPr>
+      <w:r>
+        <w:rPr>
+          <w:rFonts w:ascii="Times New Roman" w:hAnsi="Times New Roman" w:cs="Times New Roman"/>
+          <w:lang w:val="ru-BY"/>
+        </w:rPr>
+        <w:t>Большие значения (в правом нижнем углу) соответствуют высокочастотным деталям и обеспечивают большее сжатие</w:t>
+      </w:r>
+    </w:p>
+    <w:p>
+      <w:pPr>
+        <w:rPr>
+          <w:rFonts w:ascii="Times New Roman" w:hAnsi="Times New Roman" w:cs="Times New Roman"/>
+          <w:lang w:val="ru-RU"/>
+        </w:rPr>
+      </w:pPr>
+    </w:p>
+    <w:p>
+      <w:pPr>
+        <w:rPr>
+          <w:rFonts w:ascii="Times New Roman" w:hAnsi="Times New Roman" w:cs="Times New Roman"/>
+          <w:b/>
+          <w:bCs/>
+          <w:lang w:val="ru-RU"/>
+        </w:rPr>
+      </w:pPr>
+      <w:r>
+        <w:rPr>
+          <w:rFonts w:ascii="Times New Roman" w:hAnsi="Times New Roman" w:cs="Times New Roman"/>
+          <w:b/>
+          <w:bCs/>
+          <w:lang w:val="ru-RU"/>
+        </w:rPr>
+        <w:t>3.</w:t>
+      </w:r>
+      <w:r>
+        <w:rPr>
+          <w:rFonts w:ascii="Times New Roman" w:hAnsi="Times New Roman" w:cs="Times New Roman"/>
+          <w:b/>
+          <w:bCs/>
+          <w:lang w:val="ru-RU"/>
+        </w:rPr>
+        <w:t>5</w:t>
+      </w:r>
+      <w:r>
+        <w:rPr>
+          <w:rFonts w:ascii="Times New Roman" w:hAnsi="Times New Roman" w:cs="Times New Roman"/>
+          <w:b/>
+          <w:bCs/>
+          <w:lang w:val="ru-RU"/>
+        </w:rPr>
+        <w:t>. Особенности реализации интерфейса</w:t>
+      </w:r>
+    </w:p>
+    <w:p>
+      <w:pPr>
+        <w:rPr>
+          <w:rFonts w:ascii="Times New Roman" w:hAnsi="Times New Roman" w:cs="Times New Roman"/>
+          <w:lang w:val="en-US"/>
+        </w:rPr>
+      </w:pPr>
+      <w:r>
+        <w:rPr>
+          <w:rFonts w:ascii="Times New Roman" w:hAnsi="Times New Roman" w:cs="Times New Roman"/>
+          <w:lang w:val="ru-RU"/>
+        </w:rPr>
+        <w:t>Многопоточная</w:t>
+      </w:r>
+      <w:r>
+        <w:rPr>
+          <w:rFonts w:ascii="Times New Roman" w:hAnsi="Times New Roman" w:cs="Times New Roman"/>
+          <w:lang w:val="en-US"/>
+        </w:rPr>
+        <w:t xml:space="preserve"> </w:t>
+      </w:r>
+      <w:r>
+        <w:rPr>
+          <w:rFonts w:ascii="Times New Roman" w:hAnsi="Times New Roman" w:cs="Times New Roman"/>
+          <w:lang w:val="ru-RU"/>
+        </w:rPr>
+        <w:t>обработка</w:t>
+      </w:r>
+      <w:r>
+        <w:rPr>
+          <w:rFonts w:ascii="Times New Roman" w:hAnsi="Times New Roman" w:cs="Times New Roman"/>
+          <w:lang w:val="en-US"/>
+        </w:rPr>
+        <w:t>:</w:t>
       </w:r>
     </w:p>
     <w:p>
@@ -1497,7 +2770,7 @@
       <w:pPr>
         <w:rPr>
           <w:rFonts w:ascii="Times New Roman" w:hAnsi="Times New Roman" w:cs="Times New Roman"/>
-          <w:lang w:val="ru-RU"/>
+          <w:lang w:val="en-US"/>
         </w:rPr>
       </w:pPr>
       <w:r>
@@ -1544,7 +2817,7 @@
       <w:pPr>
         <w:rPr>
           <w:rFonts w:ascii="Times New Roman" w:hAnsi="Times New Roman" w:cs="Times New Roman"/>
-          <w:lang w:val="ru-RU"/>
+          <w:lang w:val="en-US"/>
         </w:rPr>
       </w:pPr>
     </w:p>
@@ -1628,7 +2901,31 @@
       <w:pPr>
         <w:rPr>
           <w:rFonts w:ascii="Times New Roman" w:hAnsi="Times New Roman" w:cs="Times New Roman"/>
-          <w:lang w:val="ru-RU"/>
+          <w:lang w:val="ru-BY"/>
+        </w:rPr>
+      </w:pPr>
+      <w:r>
+        <w:rPr>
+          <w:rFonts w:ascii="Times New Roman" w:hAnsi="Times New Roman" w:cs="Times New Roman"/>
+          <w:b/>
+          <w:bCs/>
+          <w:lang w:val="ru-BY"/>
+        </w:rPr>
+        <w:t xml:space="preserve">- </w:t>
+      </w:r>
+      <w:r>
+        <w:rPr>
+          <w:rFonts w:ascii="Times New Roman" w:hAnsi="Times New Roman" w:cs="Times New Roman"/>
+          <w:lang w:val="ru-BY"/>
+        </w:rPr>
+        <w:t>Диалоговое окно с фиксированным размером для отображения матрицы квантования</w:t>
+      </w:r>
+    </w:p>
+    <w:p>
+      <w:pPr>
+        <w:rPr>
+          <w:rFonts w:ascii="Times New Roman" w:hAnsi="Times New Roman" w:cs="Times New Roman"/>
+          <w:lang w:val="ru-BY"/>
         </w:rPr>
       </w:pPr>
     </w:p>
@@ -1744,6 +3041,7 @@
           <w:rFonts w:ascii="Times New Roman" w:hAnsi="Times New Roman" w:cs="Times New Roman"/>
           <w:lang w:val="ru-RU"/>
         </w:rPr>
+        <w:lastRenderedPageBreak/>
         <w:t xml:space="preserve">Решение: Комбинированный подход с использованием </w:t>
       </w:r>
       <w:proofErr w:type="spellStart"/>
@@ -1851,6 +3149,60 @@
           <w:lang w:val="ru-RU"/>
         </w:rPr>
         <w:t xml:space="preserve"> на 72 DPI</w:t>
+      </w:r>
+    </w:p>
+    <w:p>
+      <w:pPr>
+        <w:rPr>
+          <w:rFonts w:ascii="Times New Roman" w:hAnsi="Times New Roman" w:cs="Times New Roman"/>
+          <w:b/>
+          <w:bCs/>
+          <w:lang w:val="ru-RU"/>
+        </w:rPr>
+      </w:pPr>
+    </w:p>
+    <w:p>
+      <w:pPr>
+        <w:rPr>
+          <w:rFonts w:ascii="Times New Roman" w:hAnsi="Times New Roman" w:cs="Times New Roman"/>
+          <w:lang w:val="ru-RU"/>
+        </w:rPr>
+      </w:pPr>
+      <w:r>
+        <w:rPr>
+          <w:rFonts w:ascii="Times New Roman" w:hAnsi="Times New Roman" w:cs="Times New Roman"/>
+          <w:b/>
+          <w:bCs/>
+        </w:rPr>
+        <w:t>4.4. Проблема: Извлечение матрицы квантования из бинарной структуры JPEG</w:t>
+      </w:r>
+    </w:p>
+    <w:p>
+      <w:pPr>
+        <w:rPr>
+          <w:rFonts w:ascii="Times New Roman" w:hAnsi="Times New Roman" w:cs="Times New Roman"/>
+          <w:lang w:val="ru-RU"/>
+        </w:rPr>
+      </w:pPr>
+      <w:r>
+        <w:rPr>
+          <w:rFonts w:ascii="Times New Roman" w:hAnsi="Times New Roman" w:cs="Times New Roman"/>
+        </w:rPr>
+        <w:t>Решение: Реализация собственного парсера, который анализирует структуру JPEG файла, находит маркер DQT и корректно считывает матрицу 8×8 с учетом порядка байт (</w:t>
+      </w:r>
+      <w:proofErr w:type="spellStart"/>
+      <w:r>
+        <w:rPr>
+          <w:rFonts w:ascii="Times New Roman" w:hAnsi="Times New Roman" w:cs="Times New Roman"/>
+        </w:rPr>
+        <w:t>big-endian</w:t>
+      </w:r>
+      <w:proofErr w:type="spellEnd"/>
+      <w:r>
+        <w:rPr>
+          <w:rFonts w:ascii="Times New Roman" w:hAnsi="Times New Roman" w:cs="Times New Roman"/>
+        </w:rPr>
+        <w:t xml:space="preserve"> для 16-битных значений)</w:t>
       </w:r>
     </w:p>
     <w:p>
@@ -1900,7 +3252,6 @@
           <w:bCs/>
           <w:lang w:val="ru-RU"/>
         </w:rPr>
-        <w:lastRenderedPageBreak/>
         <w:t>5.1. Поддерживаемые форматы</w:t>
       </w:r>
     </w:p>
@@ -1916,7 +3267,27 @@
           <w:rFonts w:ascii="Times New Roman" w:hAnsi="Times New Roman" w:cs="Times New Roman"/>
           <w:lang w:val="ru-RU"/>
         </w:rPr>
-        <w:t>- JPEG/JPG (с информацией о JPEG-сжатии)</w:t>
+        <w:t>- JPEG/JPG (с информацией о JPEG-сжатии</w:t>
+      </w:r>
+      <w:r>
+        <w:rPr>
+          <w:rFonts w:ascii="Times New Roman" w:hAnsi="Times New Roman" w:cs="Times New Roman"/>
+          <w:lang w:val="ru-RU"/>
+        </w:rPr>
+        <w:t xml:space="preserve"> </w:t>
+      </w:r>
+      <w:r>
+        <w:rPr>
+          <w:rFonts w:ascii="Times New Roman" w:hAnsi="Times New Roman" w:cs="Times New Roman"/>
+        </w:rPr>
+        <w:t>и возможностью просмотра матрицы квантования</w:t>
+      </w:r>
+      <w:r>
+        <w:rPr>
+          <w:rFonts w:ascii="Times New Roman" w:hAnsi="Times New Roman" w:cs="Times New Roman"/>
+          <w:lang w:val="ru-RU"/>
+        </w:rPr>
+        <w:t>)</w:t>
       </w:r>
     </w:p>
     <w:p>
@@ -2147,26 +3518,50 @@
       <w:pPr>
         <w:rPr>
           <w:rFonts w:ascii="Times New Roman" w:hAnsi="Times New Roman" w:cs="Times New Roman"/>
-          <w:lang w:val="ru-RU"/>
-        </w:rPr>
-      </w:pPr>
-    </w:p>
-    <w:p>
-      <w:pPr>
+          <w:lang w:val="ru-BY"/>
+        </w:rPr>
+      </w:pPr>
+      <w:r>
         <w:rPr>
           <w:rFonts w:ascii="Times New Roman" w:hAnsi="Times New Roman" w:cs="Times New Roman"/>
           <w:b/>
           <w:bCs/>
-          <w:lang w:val="ru-RU"/>
-        </w:rPr>
-      </w:pPr>
-      <w:r>
+          <w:lang w:val="ru-BY"/>
+        </w:rPr>
+        <w:t xml:space="preserve">- </w:t>
+      </w:r>
+      <w:r>
+        <w:rPr>
+          <w:rFonts w:ascii="Times New Roman" w:hAnsi="Times New Roman" w:cs="Times New Roman"/>
+          <w:lang w:val="ru-BY"/>
+        </w:rPr>
+        <w:t>Наличие матрицы квантования (для JPEG файлов)</w:t>
+      </w:r>
+    </w:p>
+    <w:p>
+      <w:pPr>
+        <w:rPr>
+          <w:rFonts w:ascii="Times New Roman" w:hAnsi="Times New Roman" w:cs="Times New Roman"/>
+          <w:lang w:val="ru-RU"/>
+        </w:rPr>
+      </w:pPr>
+    </w:p>
+    <w:p>
+      <w:pPr>
         <w:rPr>
           <w:rFonts w:ascii="Times New Roman" w:hAnsi="Times New Roman" w:cs="Times New Roman"/>
           <w:b/>
           <w:bCs/>
           <w:lang w:val="ru-RU"/>
         </w:rPr>
+      </w:pPr>
+      <w:r>
+        <w:rPr>
+          <w:rFonts w:ascii="Times New Roman" w:hAnsi="Times New Roman" w:cs="Times New Roman"/>
+          <w:b/>
+          <w:bCs/>
+          <w:lang w:val="ru-RU"/>
+        </w:rPr>
         <w:t>5.3. Особенности интерфейса</w:t>
       </w:r>
     </w:p>
@@ -2197,6 +3592,7 @@
           <w:rFonts w:ascii="Times New Roman" w:hAnsi="Times New Roman" w:cs="Times New Roman"/>
           <w:lang w:val="ru-RU"/>
         </w:rPr>
+        <w:lastRenderedPageBreak/>
         <w:t>- Прогресс-бар для визуализации процесса</w:t>
       </w:r>
     </w:p>
@@ -2228,6 +3624,59 @@
           <w:lang w:val="ru-RU"/>
         </w:rPr>
         <w:t>- Подсветка четных/нечетных строк для улучшения читаемости</w:t>
+      </w:r>
+    </w:p>
+    <w:p>
+      <w:pPr>
+        <w:rPr>
+          <w:rFonts w:ascii="Times New Roman" w:hAnsi="Times New Roman" w:cs="Times New Roman"/>
+          <w:lang w:val="ru-BY"/>
+        </w:rPr>
+      </w:pPr>
+      <w:r>
+        <w:rPr>
+          <w:rFonts w:ascii="Times New Roman" w:hAnsi="Times New Roman" w:cs="Times New Roman"/>
+          <w:b/>
+          <w:bCs/>
+          <w:lang w:val="ru-BY"/>
+        </w:rPr>
+        <w:t>-</w:t>
+      </w:r>
+      <w:r>
+        <w:rPr>
+          <w:rFonts w:ascii="Times New Roman" w:hAnsi="Times New Roman" w:cs="Times New Roman"/>
+          <w:lang w:val="ru-BY"/>
+        </w:rPr>
+        <w:t xml:space="preserve"> </w:t>
+      </w:r>
+      <w:r>
+        <w:rPr>
+          <w:rFonts w:ascii="Times New Roman" w:hAnsi="Times New Roman" w:cs="Times New Roman"/>
+          <w:lang w:val="ru-BY"/>
+        </w:rPr>
+        <w:t>Для JPEG файлов в колонке "Матрица квантования" отображается "Есть (двойной клик)"</w:t>
+      </w:r>
+    </w:p>
+    <w:p>
+      <w:pPr>
+        <w:rPr>
+          <w:rFonts w:ascii="Times New Roman" w:hAnsi="Times New Roman" w:cs="Times New Roman"/>
+          <w:lang w:val="ru-BY"/>
+        </w:rPr>
+      </w:pPr>
+      <w:r>
+        <w:rPr>
+          <w:rFonts w:ascii="Times New Roman" w:hAnsi="Times New Roman" w:cs="Times New Roman"/>
+          <w:lang w:val="ru-BY"/>
+        </w:rPr>
+        <w:t xml:space="preserve">- </w:t>
+      </w:r>
+      <w:r>
+        <w:rPr>
+          <w:rFonts w:ascii="Times New Roman" w:hAnsi="Times New Roman" w:cs="Times New Roman"/>
+          <w:lang w:val="ru-BY"/>
+        </w:rPr>
+        <w:t>При двойном клике открывается диалоговое окно с матрицей 8×8 в удобном для чтения формате</w:t>
       </w:r>
     </w:p>
     <w:p>
@@ -2344,26 +3793,72 @@
       <w:pPr>
         <w:rPr>
           <w:rFonts w:ascii="Times New Roman" w:hAnsi="Times New Roman" w:cs="Times New Roman"/>
-          <w:lang w:val="ru-RU"/>
-        </w:rPr>
-      </w:pPr>
-    </w:p>
-    <w:p>
-      <w:pPr>
+          <w:lang w:val="ru-BY"/>
+        </w:rPr>
+      </w:pPr>
+      <w:r>
         <w:rPr>
           <w:rFonts w:ascii="Times New Roman" w:hAnsi="Times New Roman" w:cs="Times New Roman"/>
           <w:b/>
           <w:bCs/>
-          <w:lang w:val="ru-RU"/>
-        </w:rPr>
-      </w:pPr>
-      <w:r>
+          <w:lang w:val="ru-BY"/>
+        </w:rPr>
+        <w:t xml:space="preserve">- </w:t>
+      </w:r>
+      <w:r>
+        <w:rPr>
+          <w:rFonts w:ascii="Times New Roman" w:hAnsi="Times New Roman" w:cs="Times New Roman"/>
+          <w:lang w:val="ru-BY"/>
+        </w:rPr>
+        <w:t>Реализован парсер для извлечения матрицы квантования из JPEG файлов</w:t>
+      </w:r>
+    </w:p>
+    <w:p>
+      <w:pPr>
+        <w:rPr>
+          <w:rFonts w:ascii="Times New Roman" w:hAnsi="Times New Roman" w:cs="Times New Roman"/>
+          <w:lang w:val="ru-BY"/>
+        </w:rPr>
+      </w:pPr>
+      <w:r>
+        <w:rPr>
+          <w:rFonts w:ascii="Times New Roman" w:hAnsi="Times New Roman" w:cs="Times New Roman"/>
+          <w:lang w:val="ru-BY"/>
+        </w:rPr>
+        <w:t xml:space="preserve">- </w:t>
+      </w:r>
+      <w:r>
+        <w:rPr>
+          <w:rFonts w:ascii="Times New Roman" w:hAnsi="Times New Roman" w:cs="Times New Roman"/>
+          <w:lang w:val="ru-BY"/>
+        </w:rPr>
+        <w:t>Добавлена возможность просмотра матрицы квантования через двойной клик в таблице</w:t>
+      </w:r>
+    </w:p>
+    <w:p>
+      <w:pPr>
+        <w:rPr>
+          <w:rFonts w:ascii="Times New Roman" w:hAnsi="Times New Roman" w:cs="Times New Roman"/>
+          <w:lang w:val="ru-RU"/>
+        </w:rPr>
+      </w:pPr>
+    </w:p>
+    <w:p>
+      <w:pPr>
         <w:rPr>
           <w:rFonts w:ascii="Times New Roman" w:hAnsi="Times New Roman" w:cs="Times New Roman"/>
           <w:b/>
           <w:bCs/>
           <w:lang w:val="ru-RU"/>
         </w:rPr>
+      </w:pPr>
+      <w:r>
+        <w:rPr>
+          <w:rFonts w:ascii="Times New Roman" w:hAnsi="Times New Roman" w:cs="Times New Roman"/>
+          <w:b/>
+          <w:bCs/>
+          <w:lang w:val="ru-RU"/>
+        </w:rPr>
         <w:t>6.2. Особенности реализации</w:t>
       </w:r>
     </w:p>
@@ -2379,7 +3874,6 @@
           <w:rFonts w:ascii="Times New Roman" w:hAnsi="Times New Roman" w:cs="Times New Roman"/>
           <w:lang w:val="ru-RU"/>
         </w:rPr>
-        <w:lastRenderedPageBreak/>
         <w:t xml:space="preserve">- Использование современных возможностей </w:t>
       </w:r>
       <w:proofErr w:type="spellStart"/>
@@ -2448,7 +3942,31 @@
       <w:pPr>
         <w:rPr>
           <w:rFonts w:ascii="Times New Roman" w:hAnsi="Times New Roman" w:cs="Times New Roman"/>
-          <w:lang w:val="ru-RU"/>
+          <w:lang w:val="ru-BY"/>
+        </w:rPr>
+      </w:pPr>
+      <w:r>
+        <w:rPr>
+          <w:rFonts w:ascii="Times New Roman" w:hAnsi="Times New Roman" w:cs="Times New Roman"/>
+          <w:b/>
+          <w:bCs/>
+          <w:lang w:val="ru-BY"/>
+        </w:rPr>
+        <w:t xml:space="preserve">- </w:t>
+      </w:r>
+      <w:r>
+        <w:rPr>
+          <w:rFonts w:ascii="Times New Roman" w:hAnsi="Times New Roman" w:cs="Times New Roman"/>
+          <w:lang w:val="ru-BY"/>
+        </w:rPr>
+        <w:t>Специализированный парсер для работы с бинарной структурой JPEG</w:t>
+      </w:r>
+    </w:p>
+    <w:p>
+      <w:pPr>
+        <w:rPr>
+          <w:rFonts w:ascii="Times New Roman" w:hAnsi="Times New Roman" w:cs="Times New Roman"/>
+          <w:lang w:val="ru-BY"/>
         </w:rPr>
       </w:pPr>
     </w:p>
@@ -2626,6 +4144,7 @@
           <w:rFonts w:ascii="Times New Roman" w:hAnsi="Times New Roman" w:cs="Times New Roman"/>
           <w:lang w:val="ru-RU"/>
         </w:rPr>
+        <w:lastRenderedPageBreak/>
         <w:t xml:space="preserve">Для извлечения метаинформации используются встроенные возможности </w:t>
       </w:r>
       <w:proofErr w:type="spellStart"/>
@@ -2882,7 +4401,31 @@
       <w:pPr>
         <w:rPr>
           <w:rFonts w:ascii="Times New Roman" w:hAnsi="Times New Roman" w:cs="Times New Roman"/>
-          <w:lang w:val="ru-RU"/>
+          <w:lang w:val="ru-BY"/>
+        </w:rPr>
+      </w:pPr>
+      <w:r>
+        <w:rPr>
+          <w:rFonts w:ascii="Times New Roman" w:hAnsi="Times New Roman" w:cs="Times New Roman"/>
+          <w:b/>
+          <w:bCs/>
+          <w:lang w:val="ru-BY"/>
+        </w:rPr>
+        <w:t xml:space="preserve">- </w:t>
+      </w:r>
+      <w:r>
+        <w:rPr>
+          <w:rFonts w:ascii="Times New Roman" w:hAnsi="Times New Roman" w:cs="Times New Roman"/>
+          <w:lang w:val="ru-BY"/>
+        </w:rPr>
+        <w:t>Собственный парсер для извлечения матрицы квантования из бинарной структуры JPEG</w:t>
+      </w:r>
+    </w:p>
+    <w:p>
+      <w:pPr>
+        <w:rPr>
+          <w:rFonts w:ascii="Times New Roman" w:hAnsi="Times New Roman" w:cs="Times New Roman"/>
+          <w:lang w:val="ru-BY"/>
         </w:rPr>
       </w:pPr>
     </w:p>
@@ -2932,15 +4475,29 @@
       <w:pPr>
         <w:rPr>
           <w:rFonts w:ascii="Times New Roman" w:hAnsi="Times New Roman" w:cs="Times New Roman"/>
-          <w:lang w:val="en-US"/>
-        </w:rPr>
-      </w:pPr>
-      <w:r>
-        <w:rPr>
-          <w:rFonts w:ascii="Times New Roman" w:hAnsi="Times New Roman" w:cs="Times New Roman"/>
-          <w:lang w:val="en-US"/>
-        </w:rPr>
-        <w:t>- Windows 10 (</w:t>
+          <w:lang w:val="ru-RU"/>
+        </w:rPr>
+      </w:pPr>
+      <w:r>
+        <w:rPr>
+          <w:rFonts w:ascii="Times New Roman" w:hAnsi="Times New Roman" w:cs="Times New Roman"/>
+          <w:lang w:val="ru-RU"/>
+        </w:rPr>
+        <w:t xml:space="preserve">- </w:t>
+      </w:r>
+      <w:r>
+        <w:rPr>
+          <w:rFonts w:ascii="Times New Roman" w:hAnsi="Times New Roman" w:cs="Times New Roman"/>
+          <w:lang w:val="en-US"/>
+        </w:rPr>
+        <w:t>Windows</w:t>
+      </w:r>
+      <w:r>
+        <w:rPr>
+          <w:rFonts w:ascii="Times New Roman" w:hAnsi="Times New Roman" w:cs="Times New Roman"/>
+          <w:lang w:val="ru-RU"/>
+        </w:rPr>
+        <w:t xml:space="preserve"> 10 (</w:t>
       </w:r>
       <w:r>
         <w:rPr>
@@ -2952,7 +4509,7 @@
       <w:r>
         <w:rPr>
           <w:rFonts w:ascii="Times New Roman" w:hAnsi="Times New Roman" w:cs="Times New Roman"/>
-          <w:lang w:val="en-US"/>
+          <w:lang w:val="ru-RU"/>
         </w:rPr>
         <w:t xml:space="preserve"> </w:t>
       </w:r>
@@ -2966,7 +4523,7 @@
       <w:r>
         <w:rPr>
           <w:rFonts w:ascii="Times New Roman" w:hAnsi="Times New Roman" w:cs="Times New Roman"/>
-          <w:lang w:val="en-US"/>
+          <w:lang w:val="ru-RU"/>
         </w:rPr>
         <w:t>)</w:t>
       </w:r>
@@ -2975,45 +4532,87 @@
       <w:pPr>
         <w:rPr>
           <w:rFonts w:ascii="Times New Roman" w:hAnsi="Times New Roman" w:cs="Times New Roman"/>
-          <w:lang w:val="en-US"/>
-        </w:rPr>
-      </w:pPr>
-      <w:r>
-        <w:rPr>
-          <w:rFonts w:ascii="Times New Roman" w:hAnsi="Times New Roman" w:cs="Times New Roman"/>
-          <w:lang w:val="en-US"/>
-        </w:rPr>
-        <w:t>- Windows 11</w:t>
-      </w:r>
-    </w:p>
-    <w:p>
-      <w:pPr>
-        <w:rPr>
-          <w:rFonts w:ascii="Times New Roman" w:hAnsi="Times New Roman" w:cs="Times New Roman"/>
-          <w:lang w:val="en-US"/>
-        </w:rPr>
-      </w:pPr>
-      <w:r>
-        <w:rPr>
-          <w:rFonts w:ascii="Times New Roman" w:hAnsi="Times New Roman" w:cs="Times New Roman"/>
-          <w:lang w:val="en-US"/>
-        </w:rPr>
-        <w:t>- Windows 8.1</w:t>
-      </w:r>
-    </w:p>
-    <w:p>
-      <w:pPr>
-        <w:rPr>
-          <w:rFonts w:ascii="Times New Roman" w:hAnsi="Times New Roman" w:cs="Times New Roman"/>
-          <w:lang w:val="en-US"/>
-        </w:rPr>
-      </w:pPr>
-      <w:r>
-        <w:rPr>
-          <w:rFonts w:ascii="Times New Roman" w:hAnsi="Times New Roman" w:cs="Times New Roman"/>
-          <w:lang w:val="en-US"/>
-        </w:rPr>
-        <w:t>- Windows 8</w:t>
+          <w:lang w:val="ru-RU"/>
+        </w:rPr>
+      </w:pPr>
+      <w:r>
+        <w:rPr>
+          <w:rFonts w:ascii="Times New Roman" w:hAnsi="Times New Roman" w:cs="Times New Roman"/>
+          <w:lang w:val="ru-RU"/>
+        </w:rPr>
+        <w:t xml:space="preserve">- </w:t>
+      </w:r>
+      <w:r>
+        <w:rPr>
+          <w:rFonts w:ascii="Times New Roman" w:hAnsi="Times New Roman" w:cs="Times New Roman"/>
+          <w:lang w:val="en-US"/>
+        </w:rPr>
+        <w:t>Windows</w:t>
+      </w:r>
+      <w:r>
+        <w:rPr>
+          <w:rFonts w:ascii="Times New Roman" w:hAnsi="Times New Roman" w:cs="Times New Roman"/>
+          <w:lang w:val="ru-RU"/>
+        </w:rPr>
+        <w:t xml:space="preserve"> 11</w:t>
+      </w:r>
+    </w:p>
+    <w:p>
+      <w:pPr>
+        <w:rPr>
+          <w:rFonts w:ascii="Times New Roman" w:hAnsi="Times New Roman" w:cs="Times New Roman"/>
+          <w:lang w:val="ru-RU"/>
+        </w:rPr>
+      </w:pPr>
+      <w:r>
+        <w:rPr>
+          <w:rFonts w:ascii="Times New Roman" w:hAnsi="Times New Roman" w:cs="Times New Roman"/>
+          <w:lang w:val="ru-RU"/>
+        </w:rPr>
+        <w:t xml:space="preserve">- </w:t>
+      </w:r>
+      <w:r>
+        <w:rPr>
+          <w:rFonts w:ascii="Times New Roman" w:hAnsi="Times New Roman" w:cs="Times New Roman"/>
+          <w:lang w:val="en-US"/>
+        </w:rPr>
+        <w:t>Windows</w:t>
+      </w:r>
+      <w:r>
+        <w:rPr>
+          <w:rFonts w:ascii="Times New Roman" w:hAnsi="Times New Roman" w:cs="Times New Roman"/>
+          <w:lang w:val="ru-RU"/>
+        </w:rPr>
+        <w:t xml:space="preserve"> 8.1</w:t>
+      </w:r>
+    </w:p>
+    <w:p>
+      <w:pPr>
+        <w:rPr>
+          <w:rFonts w:ascii="Times New Roman" w:hAnsi="Times New Roman" w:cs="Times New Roman"/>
+          <w:lang w:val="ru-RU"/>
+        </w:rPr>
+      </w:pPr>
+      <w:r>
+        <w:rPr>
+          <w:rFonts w:ascii="Times New Roman" w:hAnsi="Times New Roman" w:cs="Times New Roman"/>
+          <w:lang w:val="ru-RU"/>
+        </w:rPr>
+        <w:t xml:space="preserve">- </w:t>
+      </w:r>
+      <w:r>
+        <w:rPr>
+          <w:rFonts w:ascii="Times New Roman" w:hAnsi="Times New Roman" w:cs="Times New Roman"/>
+          <w:lang w:val="en-US"/>
+        </w:rPr>
+        <w:t>Windows</w:t>
+      </w:r>
+      <w:r>
+        <w:rPr>
+          <w:rFonts w:ascii="Times New Roman" w:hAnsi="Times New Roman" w:cs="Times New Roman"/>
+          <w:lang w:val="ru-RU"/>
+        </w:rPr>
+        <w:t xml:space="preserve"> 8</w:t>
       </w:r>
     </w:p>
     <w:p>
@@ -3170,6 +4769,20 @@
           <w:lang w:val="ru-RU"/>
         </w:rPr>
       </w:pPr>
+      <w:r>
+        <w:rPr>
+          <w:rFonts w:ascii="Times New Roman" w:hAnsi="Times New Roman" w:cs="Times New Roman"/>
+        </w:rPr>
+        <w:t>Особое внимание было уделено формату JPEG, для которого реализована возможность извлечения и отображения матрицы квантования - ключевого компонента алгоритма сжатия, определяющего баланс между качеством изображения и степенью сжатия.</w:t>
+      </w:r>
+    </w:p>
+    <w:p>
+      <w:pPr>
+        <w:rPr>
+          <w:rFonts w:ascii="Times New Roman" w:hAnsi="Times New Roman" w:cs="Times New Roman"/>
+          <w:lang w:val="ru-RU"/>
+        </w:rPr>
+      </w:pPr>
     </w:p>
     <w:p>
       <w:pPr>
@@ -3213,6 +4826,7 @@
           <w:rFonts w:ascii="Times New Roman" w:hAnsi="Times New Roman" w:cs="Times New Roman"/>
           <w:lang w:val="ru-RU"/>
         </w:rPr>
+        <w:lastRenderedPageBreak/>
         <w:t xml:space="preserve">- Навыки работы с многопоточностью в </w:t>
       </w:r>
       <w:proofErr w:type="spellStart"/>
@@ -3253,6 +4867,52 @@
           <w:lang w:val="ru-RU"/>
         </w:rPr>
         <w:t>- Разработку эффективного пользовательского интерфейса для представления табличных данных</w:t>
+      </w:r>
+    </w:p>
+    <w:p>
+      <w:pPr>
+        <w:rPr>
+          <w:rFonts w:ascii="Times New Roman" w:hAnsi="Times New Roman" w:cs="Times New Roman"/>
+          <w:lang w:val="ru-BY"/>
+        </w:rPr>
+      </w:pPr>
+      <w:r>
+        <w:rPr>
+          <w:rFonts w:ascii="Times New Roman" w:hAnsi="Times New Roman" w:cs="Times New Roman"/>
+          <w:b/>
+          <w:bCs/>
+          <w:lang w:val="ru-BY"/>
+        </w:rPr>
+        <w:t xml:space="preserve">- </w:t>
+      </w:r>
+      <w:r>
+        <w:rPr>
+          <w:rFonts w:ascii="Times New Roman" w:hAnsi="Times New Roman" w:cs="Times New Roman"/>
+          <w:lang w:val="ru-BY"/>
+        </w:rPr>
+        <w:t>Понимание алгоритма JPEG и роли матрицы квантования в процессе сжатия</w:t>
+      </w:r>
+    </w:p>
+    <w:p>
+      <w:pPr>
+        <w:rPr>
+          <w:rFonts w:ascii="Times New Roman" w:hAnsi="Times New Roman" w:cs="Times New Roman"/>
+          <w:lang w:val="ru-BY"/>
+        </w:rPr>
+      </w:pPr>
+      <w:r>
+        <w:rPr>
+          <w:rFonts w:ascii="Times New Roman" w:hAnsi="Times New Roman" w:cs="Times New Roman"/>
+          <w:lang w:val="ru-BY"/>
+        </w:rPr>
+        <w:t xml:space="preserve">- </w:t>
+      </w:r>
+      <w:r>
+        <w:rPr>
+          <w:rFonts w:ascii="Times New Roman" w:hAnsi="Times New Roman" w:cs="Times New Roman"/>
+          <w:lang w:val="ru-BY"/>
+        </w:rPr>
+        <w:t>Опыт работы с бинарными структурами файлов и парсингом специализированных форматов</w:t>
       </w:r>
     </w:p>
     <w:sectPr>
@@ -3268,6 +4928,155 @@
 <file path=word/numbering.xml><?xml version="1.0" encoding="utf-8"?>
 <w:numbering xmlns:wpc="http://schemas.microsoft.com/office/word/2010/wordprocessingCanvas" xmlns:cx="http://schemas.microsoft.com/office/drawing/2014/chartex" xmlns:cx1="http://schemas.microsoft.com/office/drawing/2015/9/8/chartex" xmlns:cx2="http://schemas.microsoft.com/office/drawing/2015/10/21/chartex" xmlns:cx3="http://schemas.microsoft.com/office/drawing/2016/5/9/chartex" xmlns:cx4="http://schemas.microsoft.com/office/drawing/2016/5/10/chartex" xmlns:cx5="http://schemas.microsoft.com/office/drawing/2016/5/11/chartex" xmlns:cx6="http://schemas.microsoft.com/office/drawing/2016/5/12/chartex" xmlns:cx7="http://schemas.microsoft.com/office/drawing/2016/5/13/chartex" xmlns:cx8="http://schemas.microsoft.com/office/drawing/2016/5/14/chartex" xmlns:mc="http://schemas.openxmlformats.org/markup-compatibility/2006" xmlns:aink="http://schemas.microsoft.com/office/drawing/2016/ink" xmlns:am3d="http://schemas.microsoft.com/office/drawing/2017/model3d" xmlns:o="urn:schemas-microsoft-com:office:office" xmlns:oel="http://schemas.microsoft.com/office/2019/extlst" xmlns:r="http://schemas.openxmlformats.org/officeDocument/2006/relationships" xmlns:m="http://schemas.openxmlformats.org/officeDocument/2006/math" xmlns:v="urn:schemas-microsoft-com:vml" xmlns:wp14="http://schemas.microsoft.com/office/word/2010/wordprocessingDrawing" xmlns:wp="http://schemas.openxmlformats.org/drawingml/2006/wordprocessingDrawing" xmlns:w10="urn:schemas-microsoft-com:office:word" xmlns:w="http://schemas.openxmlformats.org/wordprocessingml/2006/main" xmlns:w14="http://schemas.microsoft.com/office/word/2010/wordml" xmlns:w15="http://schemas.microsoft.com/office/word/2012/wordml" xmlns:w16cex="http://schemas.microsoft.com/office/word/2018/wordml/cex" xmlns:w16cid="http://schemas.microsoft.com/office/word/2016/wordml/cid" xmlns:w16="http://schemas.microsoft.com/office/word/2018/wordml" xmlns:w16du="http://schemas.microsoft.com/office/word/2023/wordml/word16du" xmlns:w16sdtdh="http://schemas.microsoft.com/office/word/2020/wordml/sdtdatahash" xmlns:w16sdtfl="http://schemas.microsoft.com/office/word/2024/wordml/sdtformatlock" xmlns:w16se="http://schemas.microsoft.com/office/word/2015/wordml/symex" xmlns:wpg="http://schemas.microsoft.com/office/word/2010/wordprocessingGroup" xmlns:wpi="http://schemas.microsoft.com/office/word/2010/wordprocessingInk" xmlns:wne="http://schemas.microsoft.com/office/word/2006/wordml" xmlns:wps="http://schemas.microsoft.com/office/word/2010/wordprocessingShape" mc:Ignorable="w14 w15 w16se w16cid w16 w16cex w16sdtdh w16sdtfl w16du wp14">
   <w:abstractNum w:abstractNumId="0" w15:restartNumberingAfterBreak="0">
+    <w:nsid w:val="088053CD"/>
+    <w:multiLevelType w:val="multilevel"/>
+    <w:tmpl w:val="44B2AD54"/>
+    <w:lvl w:ilvl="0">
+      <w:start w:val="1"/>
+      <w:numFmt w:val="bullet"/>
+      <w:lvlText w:val=""/>
+      <w:lvlJc w:val="left"/>
+      <w:pPr>
+        <w:tabs>
+          <w:tab w:val="num" w:pos="720"/>
+        </w:tabs>
+        <w:ind w:left="720" w:hanging="360"/>
+      </w:pPr>
+      <w:rPr>
+        <w:rFonts w:ascii="Symbol" w:hAnsi="Symbol" w:hint="default"/>
+        <w:sz w:val="20"/>
+      </w:rPr>
+    </w:lvl>
+    <w:lvl w:ilvl="1" w:tentative="1">
+      <w:start w:val="1"/>
+      <w:numFmt w:val="bullet"/>
+      <w:lvlText w:val="o"/>
+      <w:lvlJc w:val="left"/>
+      <w:pPr>
+        <w:tabs>
+          <w:tab w:val="num" w:pos="1440"/>
+        </w:tabs>
+        <w:ind w:left="1440" w:hanging="360"/>
+      </w:pPr>
+      <w:rPr>
+        <w:rFonts w:ascii="Courier New" w:hAnsi="Courier New" w:hint="default"/>
+        <w:sz w:val="20"/>
+      </w:rPr>
+    </w:lvl>
+    <w:lvl w:ilvl="2" w:tentative="1">
+      <w:start w:val="1"/>
+      <w:numFmt w:val="bullet"/>
+      <w:lvlText w:val=""/>
+      <w:lvlJc w:val="left"/>
+      <w:pPr>
+        <w:tabs>
+          <w:tab w:val="num" w:pos="2160"/>
+        </w:tabs>
+        <w:ind w:left="2160" w:hanging="360"/>
+      </w:pPr>
+      <w:rPr>
+        <w:rFonts w:ascii="Wingdings" w:hAnsi="Wingdings" w:hint="default"/>
+        <w:sz w:val="20"/>
+      </w:rPr>
+    </w:lvl>
+    <w:lvl w:ilvl="3" w:tentative="1">
+      <w:start w:val="1"/>
+      <w:numFmt w:val="bullet"/>
+      <w:lvlText w:val=""/>
+      <w:lvlJc w:val="left"/>
+      <w:pPr>
+        <w:tabs>
+          <w:tab w:val="num" w:pos="2880"/>
+        </w:tabs>
+        <w:ind w:left="2880" w:hanging="360"/>
+      </w:pPr>
+      <w:rPr>
+        <w:rFonts w:ascii="Wingdings" w:hAnsi="Wingdings" w:hint="default"/>
+        <w:sz w:val="20"/>
+      </w:rPr>
+    </w:lvl>
+    <w:lvl w:ilvl="4" w:tentative="1">
+      <w:start w:val="1"/>
+      <w:numFmt w:val="bullet"/>
+      <w:lvlText w:val=""/>
+      <w:lvlJc w:val="left"/>
+      <w:pPr>
+        <w:tabs>
+          <w:tab w:val="num" w:pos="3600"/>
+        </w:tabs>
+        <w:ind w:left="3600" w:hanging="360"/>
+      </w:pPr>
+      <w:rPr>
+        <w:rFonts w:ascii="Wingdings" w:hAnsi="Wingdings" w:hint="default"/>
+        <w:sz w:val="20"/>
+      </w:rPr>
+    </w:lvl>
+    <w:lvl w:ilvl="5" w:tentative="1">
+      <w:start w:val="1"/>
+      <w:numFmt w:val="bullet"/>
+      <w:lvlText w:val=""/>
+      <w:lvlJc w:val="left"/>
+      <w:pPr>
+        <w:tabs>
+          <w:tab w:val="num" w:pos="4320"/>
+        </w:tabs>
+        <w:ind w:left="4320" w:hanging="360"/>
+      </w:pPr>
+      <w:rPr>
+        <w:rFonts w:ascii="Wingdings" w:hAnsi="Wingdings" w:hint="default"/>
+        <w:sz w:val="20"/>
+      </w:rPr>
+    </w:lvl>
+    <w:lvl w:ilvl="6" w:tentative="1">
+      <w:start w:val="1"/>
+      <w:numFmt w:val="bullet"/>
+      <w:lvlText w:val=""/>
+      <w:lvlJc w:val="left"/>
+      <w:pPr>
+        <w:tabs>
+          <w:tab w:val="num" w:pos="5040"/>
+        </w:tabs>
+        <w:ind w:left="5040" w:hanging="360"/>
+      </w:pPr>
+      <w:rPr>
+        <w:rFonts w:ascii="Wingdings" w:hAnsi="Wingdings" w:hint="default"/>
+        <w:sz w:val="20"/>
+      </w:rPr>
+    </w:lvl>
+    <w:lvl w:ilvl="7" w:tentative="1">
+      <w:start w:val="1"/>
+      <w:numFmt w:val="bullet"/>
+      <w:lvlText w:val=""/>
+      <w:lvlJc w:val="left"/>
+      <w:pPr>
+        <w:tabs>
+          <w:tab w:val="num" w:pos="5760"/>
+        </w:tabs>
+        <w:ind w:left="5760" w:hanging="360"/>
+      </w:pPr>
+      <w:rPr>
+        <w:rFonts w:ascii="Wingdings" w:hAnsi="Wingdings" w:hint="default"/>
+        <w:sz w:val="20"/>
+      </w:rPr>
+    </w:lvl>
+    <w:lvl w:ilvl="8" w:tentative="1">
+      <w:start w:val="1"/>
+      <w:numFmt w:val="bullet"/>
+      <w:lvlText w:val=""/>
+      <w:lvlJc w:val="left"/>
+      <w:pPr>
+        <w:tabs>
+          <w:tab w:val="num" w:pos="6480"/>
+        </w:tabs>
+        <w:ind w:left="6480" w:hanging="360"/>
+      </w:pPr>
+      <w:rPr>
+        <w:rFonts w:ascii="Wingdings" w:hAnsi="Wingdings" w:hint="default"/>
+        <w:sz w:val="20"/>
+      </w:rPr>
+    </w:lvl>
+  </w:abstractNum>
+  <w:abstractNum w:abstractNumId="1" w15:restartNumberingAfterBreak="0">
     <w:nsid w:val="1695745F"/>
     <w:multiLevelType w:val="multilevel"/>
     <w:tmpl w:val="7C904404"/>
@@ -3416,8 +5225,1460 @@
       </w:rPr>
     </w:lvl>
   </w:abstractNum>
+  <w:abstractNum w:abstractNumId="2" w15:restartNumberingAfterBreak="0">
+    <w:nsid w:val="209405BA"/>
+    <w:multiLevelType w:val="multilevel"/>
+    <w:tmpl w:val="E6725EFA"/>
+    <w:lvl w:ilvl="0">
+      <w:start w:val="1"/>
+      <w:numFmt w:val="bullet"/>
+      <w:lvlText w:val=""/>
+      <w:lvlJc w:val="left"/>
+      <w:pPr>
+        <w:tabs>
+          <w:tab w:val="num" w:pos="720"/>
+        </w:tabs>
+        <w:ind w:left="720" w:hanging="360"/>
+      </w:pPr>
+      <w:rPr>
+        <w:rFonts w:ascii="Symbol" w:hAnsi="Symbol" w:hint="default"/>
+        <w:sz w:val="20"/>
+      </w:rPr>
+    </w:lvl>
+    <w:lvl w:ilvl="1" w:tentative="1">
+      <w:start w:val="1"/>
+      <w:numFmt w:val="bullet"/>
+      <w:lvlText w:val="o"/>
+      <w:lvlJc w:val="left"/>
+      <w:pPr>
+        <w:tabs>
+          <w:tab w:val="num" w:pos="1440"/>
+        </w:tabs>
+        <w:ind w:left="1440" w:hanging="360"/>
+      </w:pPr>
+      <w:rPr>
+        <w:rFonts w:ascii="Courier New" w:hAnsi="Courier New" w:hint="default"/>
+        <w:sz w:val="20"/>
+      </w:rPr>
+    </w:lvl>
+    <w:lvl w:ilvl="2" w:tentative="1">
+      <w:start w:val="1"/>
+      <w:numFmt w:val="bullet"/>
+      <w:lvlText w:val=""/>
+      <w:lvlJc w:val="left"/>
+      <w:pPr>
+        <w:tabs>
+          <w:tab w:val="num" w:pos="2160"/>
+        </w:tabs>
+        <w:ind w:left="2160" w:hanging="360"/>
+      </w:pPr>
+      <w:rPr>
+        <w:rFonts w:ascii="Wingdings" w:hAnsi="Wingdings" w:hint="default"/>
+        <w:sz w:val="20"/>
+      </w:rPr>
+    </w:lvl>
+    <w:lvl w:ilvl="3" w:tentative="1">
+      <w:start w:val="1"/>
+      <w:numFmt w:val="bullet"/>
+      <w:lvlText w:val=""/>
+      <w:lvlJc w:val="left"/>
+      <w:pPr>
+        <w:tabs>
+          <w:tab w:val="num" w:pos="2880"/>
+        </w:tabs>
+        <w:ind w:left="2880" w:hanging="360"/>
+      </w:pPr>
+      <w:rPr>
+        <w:rFonts w:ascii="Wingdings" w:hAnsi="Wingdings" w:hint="default"/>
+        <w:sz w:val="20"/>
+      </w:rPr>
+    </w:lvl>
+    <w:lvl w:ilvl="4" w:tentative="1">
+      <w:start w:val="1"/>
+      <w:numFmt w:val="bullet"/>
+      <w:lvlText w:val=""/>
+      <w:lvlJc w:val="left"/>
+      <w:pPr>
+        <w:tabs>
+          <w:tab w:val="num" w:pos="3600"/>
+        </w:tabs>
+        <w:ind w:left="3600" w:hanging="360"/>
+      </w:pPr>
+      <w:rPr>
+        <w:rFonts w:ascii="Wingdings" w:hAnsi="Wingdings" w:hint="default"/>
+        <w:sz w:val="20"/>
+      </w:rPr>
+    </w:lvl>
+    <w:lvl w:ilvl="5" w:tentative="1">
+      <w:start w:val="1"/>
+      <w:numFmt w:val="bullet"/>
+      <w:lvlText w:val=""/>
+      <w:lvlJc w:val="left"/>
+      <w:pPr>
+        <w:tabs>
+          <w:tab w:val="num" w:pos="4320"/>
+        </w:tabs>
+        <w:ind w:left="4320" w:hanging="360"/>
+      </w:pPr>
+      <w:rPr>
+        <w:rFonts w:ascii="Wingdings" w:hAnsi="Wingdings" w:hint="default"/>
+        <w:sz w:val="20"/>
+      </w:rPr>
+    </w:lvl>
+    <w:lvl w:ilvl="6" w:tentative="1">
+      <w:start w:val="1"/>
+      <w:numFmt w:val="bullet"/>
+      <w:lvlText w:val=""/>
+      <w:lvlJc w:val="left"/>
+      <w:pPr>
+        <w:tabs>
+          <w:tab w:val="num" w:pos="5040"/>
+        </w:tabs>
+        <w:ind w:left="5040" w:hanging="360"/>
+      </w:pPr>
+      <w:rPr>
+        <w:rFonts w:ascii="Wingdings" w:hAnsi="Wingdings" w:hint="default"/>
+        <w:sz w:val="20"/>
+      </w:rPr>
+    </w:lvl>
+    <w:lvl w:ilvl="7" w:tentative="1">
+      <w:start w:val="1"/>
+      <w:numFmt w:val="bullet"/>
+      <w:lvlText w:val=""/>
+      <w:lvlJc w:val="left"/>
+      <w:pPr>
+        <w:tabs>
+          <w:tab w:val="num" w:pos="5760"/>
+        </w:tabs>
+        <w:ind w:left="5760" w:hanging="360"/>
+      </w:pPr>
+      <w:rPr>
+        <w:rFonts w:ascii="Wingdings" w:hAnsi="Wingdings" w:hint="default"/>
+        <w:sz w:val="20"/>
+      </w:rPr>
+    </w:lvl>
+    <w:lvl w:ilvl="8" w:tentative="1">
+      <w:start w:val="1"/>
+      <w:numFmt w:val="bullet"/>
+      <w:lvlText w:val=""/>
+      <w:lvlJc w:val="left"/>
+      <w:pPr>
+        <w:tabs>
+          <w:tab w:val="num" w:pos="6480"/>
+        </w:tabs>
+        <w:ind w:left="6480" w:hanging="360"/>
+      </w:pPr>
+      <w:rPr>
+        <w:rFonts w:ascii="Wingdings" w:hAnsi="Wingdings" w:hint="default"/>
+        <w:sz w:val="20"/>
+      </w:rPr>
+    </w:lvl>
+  </w:abstractNum>
+  <w:abstractNum w:abstractNumId="3" w15:restartNumberingAfterBreak="0">
+    <w:nsid w:val="255A2A25"/>
+    <w:multiLevelType w:val="multilevel"/>
+    <w:tmpl w:val="15720E1A"/>
+    <w:lvl w:ilvl="0">
+      <w:start w:val="1"/>
+      <w:numFmt w:val="bullet"/>
+      <w:lvlText w:val=""/>
+      <w:lvlJc w:val="left"/>
+      <w:pPr>
+        <w:tabs>
+          <w:tab w:val="num" w:pos="720"/>
+        </w:tabs>
+        <w:ind w:left="720" w:hanging="360"/>
+      </w:pPr>
+      <w:rPr>
+        <w:rFonts w:ascii="Symbol" w:hAnsi="Symbol" w:hint="default"/>
+        <w:sz w:val="20"/>
+      </w:rPr>
+    </w:lvl>
+    <w:lvl w:ilvl="1" w:tentative="1">
+      <w:start w:val="1"/>
+      <w:numFmt w:val="bullet"/>
+      <w:lvlText w:val="o"/>
+      <w:lvlJc w:val="left"/>
+      <w:pPr>
+        <w:tabs>
+          <w:tab w:val="num" w:pos="1440"/>
+        </w:tabs>
+        <w:ind w:left="1440" w:hanging="360"/>
+      </w:pPr>
+      <w:rPr>
+        <w:rFonts w:ascii="Courier New" w:hAnsi="Courier New" w:hint="default"/>
+        <w:sz w:val="20"/>
+      </w:rPr>
+    </w:lvl>
+    <w:lvl w:ilvl="2" w:tentative="1">
+      <w:start w:val="1"/>
+      <w:numFmt w:val="bullet"/>
+      <w:lvlText w:val=""/>
+      <w:lvlJc w:val="left"/>
+      <w:pPr>
+        <w:tabs>
+          <w:tab w:val="num" w:pos="2160"/>
+        </w:tabs>
+        <w:ind w:left="2160" w:hanging="360"/>
+      </w:pPr>
+      <w:rPr>
+        <w:rFonts w:ascii="Wingdings" w:hAnsi="Wingdings" w:hint="default"/>
+        <w:sz w:val="20"/>
+      </w:rPr>
+    </w:lvl>
+    <w:lvl w:ilvl="3" w:tentative="1">
+      <w:start w:val="1"/>
+      <w:numFmt w:val="bullet"/>
+      <w:lvlText w:val=""/>
+      <w:lvlJc w:val="left"/>
+      <w:pPr>
+        <w:tabs>
+          <w:tab w:val="num" w:pos="2880"/>
+        </w:tabs>
+        <w:ind w:left="2880" w:hanging="360"/>
+      </w:pPr>
+      <w:rPr>
+        <w:rFonts w:ascii="Wingdings" w:hAnsi="Wingdings" w:hint="default"/>
+        <w:sz w:val="20"/>
+      </w:rPr>
+    </w:lvl>
+    <w:lvl w:ilvl="4" w:tentative="1">
+      <w:start w:val="1"/>
+      <w:numFmt w:val="bullet"/>
+      <w:lvlText w:val=""/>
+      <w:lvlJc w:val="left"/>
+      <w:pPr>
+        <w:tabs>
+          <w:tab w:val="num" w:pos="3600"/>
+        </w:tabs>
+        <w:ind w:left="3600" w:hanging="360"/>
+      </w:pPr>
+      <w:rPr>
+        <w:rFonts w:ascii="Wingdings" w:hAnsi="Wingdings" w:hint="default"/>
+        <w:sz w:val="20"/>
+      </w:rPr>
+    </w:lvl>
+    <w:lvl w:ilvl="5" w:tentative="1">
+      <w:start w:val="1"/>
+      <w:numFmt w:val="bullet"/>
+      <w:lvlText w:val=""/>
+      <w:lvlJc w:val="left"/>
+      <w:pPr>
+        <w:tabs>
+          <w:tab w:val="num" w:pos="4320"/>
+        </w:tabs>
+        <w:ind w:left="4320" w:hanging="360"/>
+      </w:pPr>
+      <w:rPr>
+        <w:rFonts w:ascii="Wingdings" w:hAnsi="Wingdings" w:hint="default"/>
+        <w:sz w:val="20"/>
+      </w:rPr>
+    </w:lvl>
+    <w:lvl w:ilvl="6" w:tentative="1">
+      <w:start w:val="1"/>
+      <w:numFmt w:val="bullet"/>
+      <w:lvlText w:val=""/>
+      <w:lvlJc w:val="left"/>
+      <w:pPr>
+        <w:tabs>
+          <w:tab w:val="num" w:pos="5040"/>
+        </w:tabs>
+        <w:ind w:left="5040" w:hanging="360"/>
+      </w:pPr>
+      <w:rPr>
+        <w:rFonts w:ascii="Wingdings" w:hAnsi="Wingdings" w:hint="default"/>
+        <w:sz w:val="20"/>
+      </w:rPr>
+    </w:lvl>
+    <w:lvl w:ilvl="7" w:tentative="1">
+      <w:start w:val="1"/>
+      <w:numFmt w:val="bullet"/>
+      <w:lvlText w:val=""/>
+      <w:lvlJc w:val="left"/>
+      <w:pPr>
+        <w:tabs>
+          <w:tab w:val="num" w:pos="5760"/>
+        </w:tabs>
+        <w:ind w:left="5760" w:hanging="360"/>
+      </w:pPr>
+      <w:rPr>
+        <w:rFonts w:ascii="Wingdings" w:hAnsi="Wingdings" w:hint="default"/>
+        <w:sz w:val="20"/>
+      </w:rPr>
+    </w:lvl>
+    <w:lvl w:ilvl="8" w:tentative="1">
+      <w:start w:val="1"/>
+      <w:numFmt w:val="bullet"/>
+      <w:lvlText w:val=""/>
+      <w:lvlJc w:val="left"/>
+      <w:pPr>
+        <w:tabs>
+          <w:tab w:val="num" w:pos="6480"/>
+        </w:tabs>
+        <w:ind w:left="6480" w:hanging="360"/>
+      </w:pPr>
+      <w:rPr>
+        <w:rFonts w:ascii="Wingdings" w:hAnsi="Wingdings" w:hint="default"/>
+        <w:sz w:val="20"/>
+      </w:rPr>
+    </w:lvl>
+  </w:abstractNum>
+  <w:abstractNum w:abstractNumId="4" w15:restartNumberingAfterBreak="0">
+    <w:nsid w:val="258E762E"/>
+    <w:multiLevelType w:val="multilevel"/>
+    <w:tmpl w:val="10DAD51A"/>
+    <w:lvl w:ilvl="0">
+      <w:start w:val="1"/>
+      <w:numFmt w:val="bullet"/>
+      <w:lvlText w:val=""/>
+      <w:lvlJc w:val="left"/>
+      <w:pPr>
+        <w:tabs>
+          <w:tab w:val="num" w:pos="720"/>
+        </w:tabs>
+        <w:ind w:left="720" w:hanging="360"/>
+      </w:pPr>
+      <w:rPr>
+        <w:rFonts w:ascii="Symbol" w:hAnsi="Symbol" w:hint="default"/>
+        <w:sz w:val="20"/>
+      </w:rPr>
+    </w:lvl>
+    <w:lvl w:ilvl="1" w:tentative="1">
+      <w:start w:val="1"/>
+      <w:numFmt w:val="bullet"/>
+      <w:lvlText w:val="o"/>
+      <w:lvlJc w:val="left"/>
+      <w:pPr>
+        <w:tabs>
+          <w:tab w:val="num" w:pos="1440"/>
+        </w:tabs>
+        <w:ind w:left="1440" w:hanging="360"/>
+      </w:pPr>
+      <w:rPr>
+        <w:rFonts w:ascii="Courier New" w:hAnsi="Courier New" w:hint="default"/>
+        <w:sz w:val="20"/>
+      </w:rPr>
+    </w:lvl>
+    <w:lvl w:ilvl="2" w:tentative="1">
+      <w:start w:val="1"/>
+      <w:numFmt w:val="bullet"/>
+      <w:lvlText w:val=""/>
+      <w:lvlJc w:val="left"/>
+      <w:pPr>
+        <w:tabs>
+          <w:tab w:val="num" w:pos="2160"/>
+        </w:tabs>
+        <w:ind w:left="2160" w:hanging="360"/>
+      </w:pPr>
+      <w:rPr>
+        <w:rFonts w:ascii="Wingdings" w:hAnsi="Wingdings" w:hint="default"/>
+        <w:sz w:val="20"/>
+      </w:rPr>
+    </w:lvl>
+    <w:lvl w:ilvl="3" w:tentative="1">
+      <w:start w:val="1"/>
+      <w:numFmt w:val="bullet"/>
+      <w:lvlText w:val=""/>
+      <w:lvlJc w:val="left"/>
+      <w:pPr>
+        <w:tabs>
+          <w:tab w:val="num" w:pos="2880"/>
+        </w:tabs>
+        <w:ind w:left="2880" w:hanging="360"/>
+      </w:pPr>
+      <w:rPr>
+        <w:rFonts w:ascii="Wingdings" w:hAnsi="Wingdings" w:hint="default"/>
+        <w:sz w:val="20"/>
+      </w:rPr>
+    </w:lvl>
+    <w:lvl w:ilvl="4" w:tentative="1">
+      <w:start w:val="1"/>
+      <w:numFmt w:val="bullet"/>
+      <w:lvlText w:val=""/>
+      <w:lvlJc w:val="left"/>
+      <w:pPr>
+        <w:tabs>
+          <w:tab w:val="num" w:pos="3600"/>
+        </w:tabs>
+        <w:ind w:left="3600" w:hanging="360"/>
+      </w:pPr>
+      <w:rPr>
+        <w:rFonts w:ascii="Wingdings" w:hAnsi="Wingdings" w:hint="default"/>
+        <w:sz w:val="20"/>
+      </w:rPr>
+    </w:lvl>
+    <w:lvl w:ilvl="5" w:tentative="1">
+      <w:start w:val="1"/>
+      <w:numFmt w:val="bullet"/>
+      <w:lvlText w:val=""/>
+      <w:lvlJc w:val="left"/>
+      <w:pPr>
+        <w:tabs>
+          <w:tab w:val="num" w:pos="4320"/>
+        </w:tabs>
+        <w:ind w:left="4320" w:hanging="360"/>
+      </w:pPr>
+      <w:rPr>
+        <w:rFonts w:ascii="Wingdings" w:hAnsi="Wingdings" w:hint="default"/>
+        <w:sz w:val="20"/>
+      </w:rPr>
+    </w:lvl>
+    <w:lvl w:ilvl="6" w:tentative="1">
+      <w:start w:val="1"/>
+      <w:numFmt w:val="bullet"/>
+      <w:lvlText w:val=""/>
+      <w:lvlJc w:val="left"/>
+      <w:pPr>
+        <w:tabs>
+          <w:tab w:val="num" w:pos="5040"/>
+        </w:tabs>
+        <w:ind w:left="5040" w:hanging="360"/>
+      </w:pPr>
+      <w:rPr>
+        <w:rFonts w:ascii="Wingdings" w:hAnsi="Wingdings" w:hint="default"/>
+        <w:sz w:val="20"/>
+      </w:rPr>
+    </w:lvl>
+    <w:lvl w:ilvl="7" w:tentative="1">
+      <w:start w:val="1"/>
+      <w:numFmt w:val="bullet"/>
+      <w:lvlText w:val=""/>
+      <w:lvlJc w:val="left"/>
+      <w:pPr>
+        <w:tabs>
+          <w:tab w:val="num" w:pos="5760"/>
+        </w:tabs>
+        <w:ind w:left="5760" w:hanging="360"/>
+      </w:pPr>
+      <w:rPr>
+        <w:rFonts w:ascii="Wingdings" w:hAnsi="Wingdings" w:hint="default"/>
+        <w:sz w:val="20"/>
+      </w:rPr>
+    </w:lvl>
+    <w:lvl w:ilvl="8" w:tentative="1">
+      <w:start w:val="1"/>
+      <w:numFmt w:val="bullet"/>
+      <w:lvlText w:val=""/>
+      <w:lvlJc w:val="left"/>
+      <w:pPr>
+        <w:tabs>
+          <w:tab w:val="num" w:pos="6480"/>
+        </w:tabs>
+        <w:ind w:left="6480" w:hanging="360"/>
+      </w:pPr>
+      <w:rPr>
+        <w:rFonts w:ascii="Wingdings" w:hAnsi="Wingdings" w:hint="default"/>
+        <w:sz w:val="20"/>
+      </w:rPr>
+    </w:lvl>
+  </w:abstractNum>
+  <w:abstractNum w:abstractNumId="5" w15:restartNumberingAfterBreak="0">
+    <w:nsid w:val="27565494"/>
+    <w:multiLevelType w:val="multilevel"/>
+    <w:tmpl w:val="F6B0684A"/>
+    <w:lvl w:ilvl="0">
+      <w:start w:val="1"/>
+      <w:numFmt w:val="bullet"/>
+      <w:lvlText w:val=""/>
+      <w:lvlJc w:val="left"/>
+      <w:pPr>
+        <w:tabs>
+          <w:tab w:val="num" w:pos="720"/>
+        </w:tabs>
+        <w:ind w:left="720" w:hanging="360"/>
+      </w:pPr>
+      <w:rPr>
+        <w:rFonts w:ascii="Symbol" w:hAnsi="Symbol" w:hint="default"/>
+        <w:sz w:val="20"/>
+      </w:rPr>
+    </w:lvl>
+    <w:lvl w:ilvl="1" w:tentative="1">
+      <w:start w:val="1"/>
+      <w:numFmt w:val="bullet"/>
+      <w:lvlText w:val="o"/>
+      <w:lvlJc w:val="left"/>
+      <w:pPr>
+        <w:tabs>
+          <w:tab w:val="num" w:pos="1440"/>
+        </w:tabs>
+        <w:ind w:left="1440" w:hanging="360"/>
+      </w:pPr>
+      <w:rPr>
+        <w:rFonts w:ascii="Courier New" w:hAnsi="Courier New" w:hint="default"/>
+        <w:sz w:val="20"/>
+      </w:rPr>
+    </w:lvl>
+    <w:lvl w:ilvl="2" w:tentative="1">
+      <w:start w:val="1"/>
+      <w:numFmt w:val="bullet"/>
+      <w:lvlText w:val=""/>
+      <w:lvlJc w:val="left"/>
+      <w:pPr>
+        <w:tabs>
+          <w:tab w:val="num" w:pos="2160"/>
+        </w:tabs>
+        <w:ind w:left="2160" w:hanging="360"/>
+      </w:pPr>
+      <w:rPr>
+        <w:rFonts w:ascii="Wingdings" w:hAnsi="Wingdings" w:hint="default"/>
+        <w:sz w:val="20"/>
+      </w:rPr>
+    </w:lvl>
+    <w:lvl w:ilvl="3" w:tentative="1">
+      <w:start w:val="1"/>
+      <w:numFmt w:val="bullet"/>
+      <w:lvlText w:val=""/>
+      <w:lvlJc w:val="left"/>
+      <w:pPr>
+        <w:tabs>
+          <w:tab w:val="num" w:pos="2880"/>
+        </w:tabs>
+        <w:ind w:left="2880" w:hanging="360"/>
+      </w:pPr>
+      <w:rPr>
+        <w:rFonts w:ascii="Wingdings" w:hAnsi="Wingdings" w:hint="default"/>
+        <w:sz w:val="20"/>
+      </w:rPr>
+    </w:lvl>
+    <w:lvl w:ilvl="4" w:tentative="1">
+      <w:start w:val="1"/>
+      <w:numFmt w:val="bullet"/>
+      <w:lvlText w:val=""/>
+      <w:lvlJc w:val="left"/>
+      <w:pPr>
+        <w:tabs>
+          <w:tab w:val="num" w:pos="3600"/>
+        </w:tabs>
+        <w:ind w:left="3600" w:hanging="360"/>
+      </w:pPr>
+      <w:rPr>
+        <w:rFonts w:ascii="Wingdings" w:hAnsi="Wingdings" w:hint="default"/>
+        <w:sz w:val="20"/>
+      </w:rPr>
+    </w:lvl>
+    <w:lvl w:ilvl="5" w:tentative="1">
+      <w:start w:val="1"/>
+      <w:numFmt w:val="bullet"/>
+      <w:lvlText w:val=""/>
+      <w:lvlJc w:val="left"/>
+      <w:pPr>
+        <w:tabs>
+          <w:tab w:val="num" w:pos="4320"/>
+        </w:tabs>
+        <w:ind w:left="4320" w:hanging="360"/>
+      </w:pPr>
+      <w:rPr>
+        <w:rFonts w:ascii="Wingdings" w:hAnsi="Wingdings" w:hint="default"/>
+        <w:sz w:val="20"/>
+      </w:rPr>
+    </w:lvl>
+    <w:lvl w:ilvl="6" w:tentative="1">
+      <w:start w:val="1"/>
+      <w:numFmt w:val="bullet"/>
+      <w:lvlText w:val=""/>
+      <w:lvlJc w:val="left"/>
+      <w:pPr>
+        <w:tabs>
+          <w:tab w:val="num" w:pos="5040"/>
+        </w:tabs>
+        <w:ind w:left="5040" w:hanging="360"/>
+      </w:pPr>
+      <w:rPr>
+        <w:rFonts w:ascii="Wingdings" w:hAnsi="Wingdings" w:hint="default"/>
+        <w:sz w:val="20"/>
+      </w:rPr>
+    </w:lvl>
+    <w:lvl w:ilvl="7" w:tentative="1">
+      <w:start w:val="1"/>
+      <w:numFmt w:val="bullet"/>
+      <w:lvlText w:val=""/>
+      <w:lvlJc w:val="left"/>
+      <w:pPr>
+        <w:tabs>
+          <w:tab w:val="num" w:pos="5760"/>
+        </w:tabs>
+        <w:ind w:left="5760" w:hanging="360"/>
+      </w:pPr>
+      <w:rPr>
+        <w:rFonts w:ascii="Wingdings" w:hAnsi="Wingdings" w:hint="default"/>
+        <w:sz w:val="20"/>
+      </w:rPr>
+    </w:lvl>
+    <w:lvl w:ilvl="8" w:tentative="1">
+      <w:start w:val="1"/>
+      <w:numFmt w:val="bullet"/>
+      <w:lvlText w:val=""/>
+      <w:lvlJc w:val="left"/>
+      <w:pPr>
+        <w:tabs>
+          <w:tab w:val="num" w:pos="6480"/>
+        </w:tabs>
+        <w:ind w:left="6480" w:hanging="360"/>
+      </w:pPr>
+      <w:rPr>
+        <w:rFonts w:ascii="Wingdings" w:hAnsi="Wingdings" w:hint="default"/>
+        <w:sz w:val="20"/>
+      </w:rPr>
+    </w:lvl>
+  </w:abstractNum>
+  <w:abstractNum w:abstractNumId="6" w15:restartNumberingAfterBreak="0">
+    <w:nsid w:val="2AA82A73"/>
+    <w:multiLevelType w:val="multilevel"/>
+    <w:tmpl w:val="7ECAAD4E"/>
+    <w:lvl w:ilvl="0">
+      <w:start w:val="1"/>
+      <w:numFmt w:val="decimal"/>
+      <w:lvlText w:val="%1."/>
+      <w:lvlJc w:val="left"/>
+      <w:pPr>
+        <w:tabs>
+          <w:tab w:val="num" w:pos="720"/>
+        </w:tabs>
+        <w:ind w:left="720" w:hanging="360"/>
+      </w:pPr>
+    </w:lvl>
+    <w:lvl w:ilvl="1" w:tentative="1">
+      <w:start w:val="1"/>
+      <w:numFmt w:val="decimal"/>
+      <w:lvlText w:val="%2."/>
+      <w:lvlJc w:val="left"/>
+      <w:pPr>
+        <w:tabs>
+          <w:tab w:val="num" w:pos="1440"/>
+        </w:tabs>
+        <w:ind w:left="1440" w:hanging="360"/>
+      </w:pPr>
+    </w:lvl>
+    <w:lvl w:ilvl="2" w:tentative="1">
+      <w:start w:val="1"/>
+      <w:numFmt w:val="decimal"/>
+      <w:lvlText w:val="%3."/>
+      <w:lvlJc w:val="left"/>
+      <w:pPr>
+        <w:tabs>
+          <w:tab w:val="num" w:pos="2160"/>
+        </w:tabs>
+        <w:ind w:left="2160" w:hanging="360"/>
+      </w:pPr>
+    </w:lvl>
+    <w:lvl w:ilvl="3" w:tentative="1">
+      <w:start w:val="1"/>
+      <w:numFmt w:val="decimal"/>
+      <w:lvlText w:val="%4."/>
+      <w:lvlJc w:val="left"/>
+      <w:pPr>
+        <w:tabs>
+          <w:tab w:val="num" w:pos="2880"/>
+        </w:tabs>
+        <w:ind w:left="2880" w:hanging="360"/>
+      </w:pPr>
+    </w:lvl>
+    <w:lvl w:ilvl="4" w:tentative="1">
+      <w:start w:val="1"/>
+      <w:numFmt w:val="decimal"/>
+      <w:lvlText w:val="%5."/>
+      <w:lvlJc w:val="left"/>
+      <w:pPr>
+        <w:tabs>
+          <w:tab w:val="num" w:pos="3600"/>
+        </w:tabs>
+        <w:ind w:left="3600" w:hanging="360"/>
+      </w:pPr>
+    </w:lvl>
+    <w:lvl w:ilvl="5" w:tentative="1">
+      <w:start w:val="1"/>
+      <w:numFmt w:val="decimal"/>
+      <w:lvlText w:val="%6."/>
+      <w:lvlJc w:val="left"/>
+      <w:pPr>
+        <w:tabs>
+          <w:tab w:val="num" w:pos="4320"/>
+        </w:tabs>
+        <w:ind w:left="4320" w:hanging="360"/>
+      </w:pPr>
+    </w:lvl>
+    <w:lvl w:ilvl="6" w:tentative="1">
+      <w:start w:val="1"/>
+      <w:numFmt w:val="decimal"/>
+      <w:lvlText w:val="%7."/>
+      <w:lvlJc w:val="left"/>
+      <w:pPr>
+        <w:tabs>
+          <w:tab w:val="num" w:pos="5040"/>
+        </w:tabs>
+        <w:ind w:left="5040" w:hanging="360"/>
+      </w:pPr>
+    </w:lvl>
+    <w:lvl w:ilvl="7" w:tentative="1">
+      <w:start w:val="1"/>
+      <w:numFmt w:val="decimal"/>
+      <w:lvlText w:val="%8."/>
+      <w:lvlJc w:val="left"/>
+      <w:pPr>
+        <w:tabs>
+          <w:tab w:val="num" w:pos="5760"/>
+        </w:tabs>
+        <w:ind w:left="5760" w:hanging="360"/>
+      </w:pPr>
+    </w:lvl>
+    <w:lvl w:ilvl="8" w:tentative="1">
+      <w:start w:val="1"/>
+      <w:numFmt w:val="decimal"/>
+      <w:lvlText w:val="%9."/>
+      <w:lvlJc w:val="left"/>
+      <w:pPr>
+        <w:tabs>
+          <w:tab w:val="num" w:pos="6480"/>
+        </w:tabs>
+        <w:ind w:left="6480" w:hanging="360"/>
+      </w:pPr>
+    </w:lvl>
+  </w:abstractNum>
+  <w:abstractNum w:abstractNumId="7" w15:restartNumberingAfterBreak="0">
+    <w:nsid w:val="454E7D99"/>
+    <w:multiLevelType w:val="multilevel"/>
+    <w:tmpl w:val="353EDCF8"/>
+    <w:lvl w:ilvl="0">
+      <w:start w:val="1"/>
+      <w:numFmt w:val="bullet"/>
+      <w:lvlText w:val=""/>
+      <w:lvlJc w:val="left"/>
+      <w:pPr>
+        <w:tabs>
+          <w:tab w:val="num" w:pos="720"/>
+        </w:tabs>
+        <w:ind w:left="720" w:hanging="360"/>
+      </w:pPr>
+      <w:rPr>
+        <w:rFonts w:ascii="Symbol" w:hAnsi="Symbol" w:hint="default"/>
+        <w:sz w:val="20"/>
+      </w:rPr>
+    </w:lvl>
+    <w:lvl w:ilvl="1" w:tentative="1">
+      <w:start w:val="1"/>
+      <w:numFmt w:val="bullet"/>
+      <w:lvlText w:val="o"/>
+      <w:lvlJc w:val="left"/>
+      <w:pPr>
+        <w:tabs>
+          <w:tab w:val="num" w:pos="1440"/>
+        </w:tabs>
+        <w:ind w:left="1440" w:hanging="360"/>
+      </w:pPr>
+      <w:rPr>
+        <w:rFonts w:ascii="Courier New" w:hAnsi="Courier New" w:hint="default"/>
+        <w:sz w:val="20"/>
+      </w:rPr>
+    </w:lvl>
+    <w:lvl w:ilvl="2" w:tentative="1">
+      <w:start w:val="1"/>
+      <w:numFmt w:val="bullet"/>
+      <w:lvlText w:val=""/>
+      <w:lvlJc w:val="left"/>
+      <w:pPr>
+        <w:tabs>
+          <w:tab w:val="num" w:pos="2160"/>
+        </w:tabs>
+        <w:ind w:left="2160" w:hanging="360"/>
+      </w:pPr>
+      <w:rPr>
+        <w:rFonts w:ascii="Wingdings" w:hAnsi="Wingdings" w:hint="default"/>
+        <w:sz w:val="20"/>
+      </w:rPr>
+    </w:lvl>
+    <w:lvl w:ilvl="3" w:tentative="1">
+      <w:start w:val="1"/>
+      <w:numFmt w:val="bullet"/>
+      <w:lvlText w:val=""/>
+      <w:lvlJc w:val="left"/>
+      <w:pPr>
+        <w:tabs>
+          <w:tab w:val="num" w:pos="2880"/>
+        </w:tabs>
+        <w:ind w:left="2880" w:hanging="360"/>
+      </w:pPr>
+      <w:rPr>
+        <w:rFonts w:ascii="Wingdings" w:hAnsi="Wingdings" w:hint="default"/>
+        <w:sz w:val="20"/>
+      </w:rPr>
+    </w:lvl>
+    <w:lvl w:ilvl="4" w:tentative="1">
+      <w:start w:val="1"/>
+      <w:numFmt w:val="bullet"/>
+      <w:lvlText w:val=""/>
+      <w:lvlJc w:val="left"/>
+      <w:pPr>
+        <w:tabs>
+          <w:tab w:val="num" w:pos="3600"/>
+        </w:tabs>
+        <w:ind w:left="3600" w:hanging="360"/>
+      </w:pPr>
+      <w:rPr>
+        <w:rFonts w:ascii="Wingdings" w:hAnsi="Wingdings" w:hint="default"/>
+        <w:sz w:val="20"/>
+      </w:rPr>
+    </w:lvl>
+    <w:lvl w:ilvl="5" w:tentative="1">
+      <w:start w:val="1"/>
+      <w:numFmt w:val="bullet"/>
+      <w:lvlText w:val=""/>
+      <w:lvlJc w:val="left"/>
+      <w:pPr>
+        <w:tabs>
+          <w:tab w:val="num" w:pos="4320"/>
+        </w:tabs>
+        <w:ind w:left="4320" w:hanging="360"/>
+      </w:pPr>
+      <w:rPr>
+        <w:rFonts w:ascii="Wingdings" w:hAnsi="Wingdings" w:hint="default"/>
+        <w:sz w:val="20"/>
+      </w:rPr>
+    </w:lvl>
+    <w:lvl w:ilvl="6" w:tentative="1">
+      <w:start w:val="1"/>
+      <w:numFmt w:val="bullet"/>
+      <w:lvlText w:val=""/>
+      <w:lvlJc w:val="left"/>
+      <w:pPr>
+        <w:tabs>
+          <w:tab w:val="num" w:pos="5040"/>
+        </w:tabs>
+        <w:ind w:left="5040" w:hanging="360"/>
+      </w:pPr>
+      <w:rPr>
+        <w:rFonts w:ascii="Wingdings" w:hAnsi="Wingdings" w:hint="default"/>
+        <w:sz w:val="20"/>
+      </w:rPr>
+    </w:lvl>
+    <w:lvl w:ilvl="7" w:tentative="1">
+      <w:start w:val="1"/>
+      <w:numFmt w:val="bullet"/>
+      <w:lvlText w:val=""/>
+      <w:lvlJc w:val="left"/>
+      <w:pPr>
+        <w:tabs>
+          <w:tab w:val="num" w:pos="5760"/>
+        </w:tabs>
+        <w:ind w:left="5760" w:hanging="360"/>
+      </w:pPr>
+      <w:rPr>
+        <w:rFonts w:ascii="Wingdings" w:hAnsi="Wingdings" w:hint="default"/>
+        <w:sz w:val="20"/>
+      </w:rPr>
+    </w:lvl>
+    <w:lvl w:ilvl="8" w:tentative="1">
+      <w:start w:val="1"/>
+      <w:numFmt w:val="bullet"/>
+      <w:lvlText w:val=""/>
+      <w:lvlJc w:val="left"/>
+      <w:pPr>
+        <w:tabs>
+          <w:tab w:val="num" w:pos="6480"/>
+        </w:tabs>
+        <w:ind w:left="6480" w:hanging="360"/>
+      </w:pPr>
+      <w:rPr>
+        <w:rFonts w:ascii="Wingdings" w:hAnsi="Wingdings" w:hint="default"/>
+        <w:sz w:val="20"/>
+      </w:rPr>
+    </w:lvl>
+  </w:abstractNum>
+  <w:abstractNum w:abstractNumId="8" w15:restartNumberingAfterBreak="0">
+    <w:nsid w:val="4F8554BB"/>
+    <w:multiLevelType w:val="multilevel"/>
+    <w:tmpl w:val="8592A0DA"/>
+    <w:lvl w:ilvl="0">
+      <w:start w:val="1"/>
+      <w:numFmt w:val="bullet"/>
+      <w:lvlText w:val=""/>
+      <w:lvlJc w:val="left"/>
+      <w:pPr>
+        <w:tabs>
+          <w:tab w:val="num" w:pos="720"/>
+        </w:tabs>
+        <w:ind w:left="720" w:hanging="360"/>
+      </w:pPr>
+      <w:rPr>
+        <w:rFonts w:ascii="Symbol" w:hAnsi="Symbol" w:hint="default"/>
+        <w:sz w:val="20"/>
+      </w:rPr>
+    </w:lvl>
+    <w:lvl w:ilvl="1" w:tentative="1">
+      <w:start w:val="1"/>
+      <w:numFmt w:val="bullet"/>
+      <w:lvlText w:val="o"/>
+      <w:lvlJc w:val="left"/>
+      <w:pPr>
+        <w:tabs>
+          <w:tab w:val="num" w:pos="1440"/>
+        </w:tabs>
+        <w:ind w:left="1440" w:hanging="360"/>
+      </w:pPr>
+      <w:rPr>
+        <w:rFonts w:ascii="Courier New" w:hAnsi="Courier New" w:hint="default"/>
+        <w:sz w:val="20"/>
+      </w:rPr>
+    </w:lvl>
+    <w:lvl w:ilvl="2" w:tentative="1">
+      <w:start w:val="1"/>
+      <w:numFmt w:val="bullet"/>
+      <w:lvlText w:val=""/>
+      <w:lvlJc w:val="left"/>
+      <w:pPr>
+        <w:tabs>
+          <w:tab w:val="num" w:pos="2160"/>
+        </w:tabs>
+        <w:ind w:left="2160" w:hanging="360"/>
+      </w:pPr>
+      <w:rPr>
+        <w:rFonts w:ascii="Wingdings" w:hAnsi="Wingdings" w:hint="default"/>
+        <w:sz w:val="20"/>
+      </w:rPr>
+    </w:lvl>
+    <w:lvl w:ilvl="3" w:tentative="1">
+      <w:start w:val="1"/>
+      <w:numFmt w:val="bullet"/>
+      <w:lvlText w:val=""/>
+      <w:lvlJc w:val="left"/>
+      <w:pPr>
+        <w:tabs>
+          <w:tab w:val="num" w:pos="2880"/>
+        </w:tabs>
+        <w:ind w:left="2880" w:hanging="360"/>
+      </w:pPr>
+      <w:rPr>
+        <w:rFonts w:ascii="Wingdings" w:hAnsi="Wingdings" w:hint="default"/>
+        <w:sz w:val="20"/>
+      </w:rPr>
+    </w:lvl>
+    <w:lvl w:ilvl="4" w:tentative="1">
+      <w:start w:val="1"/>
+      <w:numFmt w:val="bullet"/>
+      <w:lvlText w:val=""/>
+      <w:lvlJc w:val="left"/>
+      <w:pPr>
+        <w:tabs>
+          <w:tab w:val="num" w:pos="3600"/>
+        </w:tabs>
+        <w:ind w:left="3600" w:hanging="360"/>
+      </w:pPr>
+      <w:rPr>
+        <w:rFonts w:ascii="Wingdings" w:hAnsi="Wingdings" w:hint="default"/>
+        <w:sz w:val="20"/>
+      </w:rPr>
+    </w:lvl>
+    <w:lvl w:ilvl="5" w:tentative="1">
+      <w:start w:val="1"/>
+      <w:numFmt w:val="bullet"/>
+      <w:lvlText w:val=""/>
+      <w:lvlJc w:val="left"/>
+      <w:pPr>
+        <w:tabs>
+          <w:tab w:val="num" w:pos="4320"/>
+        </w:tabs>
+        <w:ind w:left="4320" w:hanging="360"/>
+      </w:pPr>
+      <w:rPr>
+        <w:rFonts w:ascii="Wingdings" w:hAnsi="Wingdings" w:hint="default"/>
+        <w:sz w:val="20"/>
+      </w:rPr>
+    </w:lvl>
+    <w:lvl w:ilvl="6" w:tentative="1">
+      <w:start w:val="1"/>
+      <w:numFmt w:val="bullet"/>
+      <w:lvlText w:val=""/>
+      <w:lvlJc w:val="left"/>
+      <w:pPr>
+        <w:tabs>
+          <w:tab w:val="num" w:pos="5040"/>
+        </w:tabs>
+        <w:ind w:left="5040" w:hanging="360"/>
+      </w:pPr>
+      <w:rPr>
+        <w:rFonts w:ascii="Wingdings" w:hAnsi="Wingdings" w:hint="default"/>
+        <w:sz w:val="20"/>
+      </w:rPr>
+    </w:lvl>
+    <w:lvl w:ilvl="7" w:tentative="1">
+      <w:start w:val="1"/>
+      <w:numFmt w:val="bullet"/>
+      <w:lvlText w:val=""/>
+      <w:lvlJc w:val="left"/>
+      <w:pPr>
+        <w:tabs>
+          <w:tab w:val="num" w:pos="5760"/>
+        </w:tabs>
+        <w:ind w:left="5760" w:hanging="360"/>
+      </w:pPr>
+      <w:rPr>
+        <w:rFonts w:ascii="Wingdings" w:hAnsi="Wingdings" w:hint="default"/>
+        <w:sz w:val="20"/>
+      </w:rPr>
+    </w:lvl>
+    <w:lvl w:ilvl="8" w:tentative="1">
+      <w:start w:val="1"/>
+      <w:numFmt w:val="bullet"/>
+      <w:lvlText w:val=""/>
+      <w:lvlJc w:val="left"/>
+      <w:pPr>
+        <w:tabs>
+          <w:tab w:val="num" w:pos="6480"/>
+        </w:tabs>
+        <w:ind w:left="6480" w:hanging="360"/>
+      </w:pPr>
+      <w:rPr>
+        <w:rFonts w:ascii="Wingdings" w:hAnsi="Wingdings" w:hint="default"/>
+        <w:sz w:val="20"/>
+      </w:rPr>
+    </w:lvl>
+  </w:abstractNum>
+  <w:abstractNum w:abstractNumId="9" w15:restartNumberingAfterBreak="0">
+    <w:nsid w:val="4FFF3936"/>
+    <w:multiLevelType w:val="multilevel"/>
+    <w:tmpl w:val="F3663E7C"/>
+    <w:lvl w:ilvl="0">
+      <w:start w:val="1"/>
+      <w:numFmt w:val="bullet"/>
+      <w:lvlText w:val=""/>
+      <w:lvlJc w:val="left"/>
+      <w:pPr>
+        <w:tabs>
+          <w:tab w:val="num" w:pos="720"/>
+        </w:tabs>
+        <w:ind w:left="720" w:hanging="360"/>
+      </w:pPr>
+      <w:rPr>
+        <w:rFonts w:ascii="Symbol" w:hAnsi="Symbol" w:hint="default"/>
+        <w:sz w:val="20"/>
+      </w:rPr>
+    </w:lvl>
+    <w:lvl w:ilvl="1" w:tentative="1">
+      <w:start w:val="1"/>
+      <w:numFmt w:val="bullet"/>
+      <w:lvlText w:val="o"/>
+      <w:lvlJc w:val="left"/>
+      <w:pPr>
+        <w:tabs>
+          <w:tab w:val="num" w:pos="1440"/>
+        </w:tabs>
+        <w:ind w:left="1440" w:hanging="360"/>
+      </w:pPr>
+      <w:rPr>
+        <w:rFonts w:ascii="Courier New" w:hAnsi="Courier New" w:hint="default"/>
+        <w:sz w:val="20"/>
+      </w:rPr>
+    </w:lvl>
+    <w:lvl w:ilvl="2" w:tentative="1">
+      <w:start w:val="1"/>
+      <w:numFmt w:val="bullet"/>
+      <w:lvlText w:val=""/>
+      <w:lvlJc w:val="left"/>
+      <w:pPr>
+        <w:tabs>
+          <w:tab w:val="num" w:pos="2160"/>
+        </w:tabs>
+        <w:ind w:left="2160" w:hanging="360"/>
+      </w:pPr>
+      <w:rPr>
+        <w:rFonts w:ascii="Wingdings" w:hAnsi="Wingdings" w:hint="default"/>
+        <w:sz w:val="20"/>
+      </w:rPr>
+    </w:lvl>
+    <w:lvl w:ilvl="3" w:tentative="1">
+      <w:start w:val="1"/>
+      <w:numFmt w:val="bullet"/>
+      <w:lvlText w:val=""/>
+      <w:lvlJc w:val="left"/>
+      <w:pPr>
+        <w:tabs>
+          <w:tab w:val="num" w:pos="2880"/>
+        </w:tabs>
+        <w:ind w:left="2880" w:hanging="360"/>
+      </w:pPr>
+      <w:rPr>
+        <w:rFonts w:ascii="Wingdings" w:hAnsi="Wingdings" w:hint="default"/>
+        <w:sz w:val="20"/>
+      </w:rPr>
+    </w:lvl>
+    <w:lvl w:ilvl="4" w:tentative="1">
+      <w:start w:val="1"/>
+      <w:numFmt w:val="bullet"/>
+      <w:lvlText w:val=""/>
+      <w:lvlJc w:val="left"/>
+      <w:pPr>
+        <w:tabs>
+          <w:tab w:val="num" w:pos="3600"/>
+        </w:tabs>
+        <w:ind w:left="3600" w:hanging="360"/>
+      </w:pPr>
+      <w:rPr>
+        <w:rFonts w:ascii="Wingdings" w:hAnsi="Wingdings" w:hint="default"/>
+        <w:sz w:val="20"/>
+      </w:rPr>
+    </w:lvl>
+    <w:lvl w:ilvl="5" w:tentative="1">
+      <w:start w:val="1"/>
+      <w:numFmt w:val="bullet"/>
+      <w:lvlText w:val=""/>
+      <w:lvlJc w:val="left"/>
+      <w:pPr>
+        <w:tabs>
+          <w:tab w:val="num" w:pos="4320"/>
+        </w:tabs>
+        <w:ind w:left="4320" w:hanging="360"/>
+      </w:pPr>
+      <w:rPr>
+        <w:rFonts w:ascii="Wingdings" w:hAnsi="Wingdings" w:hint="default"/>
+        <w:sz w:val="20"/>
+      </w:rPr>
+    </w:lvl>
+    <w:lvl w:ilvl="6" w:tentative="1">
+      <w:start w:val="1"/>
+      <w:numFmt w:val="bullet"/>
+      <w:lvlText w:val=""/>
+      <w:lvlJc w:val="left"/>
+      <w:pPr>
+        <w:tabs>
+          <w:tab w:val="num" w:pos="5040"/>
+        </w:tabs>
+        <w:ind w:left="5040" w:hanging="360"/>
+      </w:pPr>
+      <w:rPr>
+        <w:rFonts w:ascii="Wingdings" w:hAnsi="Wingdings" w:hint="default"/>
+        <w:sz w:val="20"/>
+      </w:rPr>
+    </w:lvl>
+    <w:lvl w:ilvl="7" w:tentative="1">
+      <w:start w:val="1"/>
+      <w:numFmt w:val="bullet"/>
+      <w:lvlText w:val=""/>
+      <w:lvlJc w:val="left"/>
+      <w:pPr>
+        <w:tabs>
+          <w:tab w:val="num" w:pos="5760"/>
+        </w:tabs>
+        <w:ind w:left="5760" w:hanging="360"/>
+      </w:pPr>
+      <w:rPr>
+        <w:rFonts w:ascii="Wingdings" w:hAnsi="Wingdings" w:hint="default"/>
+        <w:sz w:val="20"/>
+      </w:rPr>
+    </w:lvl>
+    <w:lvl w:ilvl="8" w:tentative="1">
+      <w:start w:val="1"/>
+      <w:numFmt w:val="bullet"/>
+      <w:lvlText w:val=""/>
+      <w:lvlJc w:val="left"/>
+      <w:pPr>
+        <w:tabs>
+          <w:tab w:val="num" w:pos="6480"/>
+        </w:tabs>
+        <w:ind w:left="6480" w:hanging="360"/>
+      </w:pPr>
+      <w:rPr>
+        <w:rFonts w:ascii="Wingdings" w:hAnsi="Wingdings" w:hint="default"/>
+        <w:sz w:val="20"/>
+      </w:rPr>
+    </w:lvl>
+  </w:abstractNum>
+  <w:abstractNum w:abstractNumId="10" w15:restartNumberingAfterBreak="0">
+    <w:nsid w:val="5C8C2527"/>
+    <w:multiLevelType w:val="hybridMultilevel"/>
+    <w:tmpl w:val="62C4899A"/>
+    <w:lvl w:ilvl="0" w:tplc="85802150">
+      <w:start w:val="5"/>
+      <w:numFmt w:val="bullet"/>
+      <w:lvlText w:val="-"/>
+      <w:lvlJc w:val="left"/>
+      <w:pPr>
+        <w:ind w:left="720" w:hanging="360"/>
+      </w:pPr>
+      <w:rPr>
+        <w:rFonts w:ascii="Times New Roman" w:eastAsiaTheme="minorHAnsi" w:hAnsi="Times New Roman" w:cs="Times New Roman" w:hint="default"/>
+        <w:b/>
+      </w:rPr>
+    </w:lvl>
+    <w:lvl w:ilvl="1" w:tplc="20000003" w:tentative="1">
+      <w:start w:val="1"/>
+      <w:numFmt w:val="bullet"/>
+      <w:lvlText w:val="o"/>
+      <w:lvlJc w:val="left"/>
+      <w:pPr>
+        <w:ind w:left="1440" w:hanging="360"/>
+      </w:pPr>
+      <w:rPr>
+        <w:rFonts w:ascii="Courier New" w:hAnsi="Courier New" w:cs="Courier New" w:hint="default"/>
+      </w:rPr>
+    </w:lvl>
+    <w:lvl w:ilvl="2" w:tplc="20000005" w:tentative="1">
+      <w:start w:val="1"/>
+      <w:numFmt w:val="bullet"/>
+      <w:lvlText w:val=""/>
+      <w:lvlJc w:val="left"/>
+      <w:pPr>
+        <w:ind w:left="2160" w:hanging="360"/>
+      </w:pPr>
+      <w:rPr>
+        <w:rFonts w:ascii="Wingdings" w:hAnsi="Wingdings" w:hint="default"/>
+      </w:rPr>
+    </w:lvl>
+    <w:lvl w:ilvl="3" w:tplc="20000001" w:tentative="1">
+      <w:start w:val="1"/>
+      <w:numFmt w:val="bullet"/>
+      <w:lvlText w:val=""/>
+      <w:lvlJc w:val="left"/>
+      <w:pPr>
+        <w:ind w:left="2880" w:hanging="360"/>
+      </w:pPr>
+      <w:rPr>
+        <w:rFonts w:ascii="Symbol" w:hAnsi="Symbol" w:hint="default"/>
+      </w:rPr>
+    </w:lvl>
+    <w:lvl w:ilvl="4" w:tplc="20000003" w:tentative="1">
+      <w:start w:val="1"/>
+      <w:numFmt w:val="bullet"/>
+      <w:lvlText w:val="o"/>
+      <w:lvlJc w:val="left"/>
+      <w:pPr>
+        <w:ind w:left="3600" w:hanging="360"/>
+      </w:pPr>
+      <w:rPr>
+        <w:rFonts w:ascii="Courier New" w:hAnsi="Courier New" w:cs="Courier New" w:hint="default"/>
+      </w:rPr>
+    </w:lvl>
+    <w:lvl w:ilvl="5" w:tplc="20000005" w:tentative="1">
+      <w:start w:val="1"/>
+      <w:numFmt w:val="bullet"/>
+      <w:lvlText w:val=""/>
+      <w:lvlJc w:val="left"/>
+      <w:pPr>
+        <w:ind w:left="4320" w:hanging="360"/>
+      </w:pPr>
+      <w:rPr>
+        <w:rFonts w:ascii="Wingdings" w:hAnsi="Wingdings" w:hint="default"/>
+      </w:rPr>
+    </w:lvl>
+    <w:lvl w:ilvl="6" w:tplc="20000001" w:tentative="1">
+      <w:start w:val="1"/>
+      <w:numFmt w:val="bullet"/>
+      <w:lvlText w:val=""/>
+      <w:lvlJc w:val="left"/>
+      <w:pPr>
+        <w:ind w:left="5040" w:hanging="360"/>
+      </w:pPr>
+      <w:rPr>
+        <w:rFonts w:ascii="Symbol" w:hAnsi="Symbol" w:hint="default"/>
+      </w:rPr>
+    </w:lvl>
+    <w:lvl w:ilvl="7" w:tplc="20000003" w:tentative="1">
+      <w:start w:val="1"/>
+      <w:numFmt w:val="bullet"/>
+      <w:lvlText w:val="o"/>
+      <w:lvlJc w:val="left"/>
+      <w:pPr>
+        <w:ind w:left="5760" w:hanging="360"/>
+      </w:pPr>
+      <w:rPr>
+        <w:rFonts w:ascii="Courier New" w:hAnsi="Courier New" w:cs="Courier New" w:hint="default"/>
+      </w:rPr>
+    </w:lvl>
+    <w:lvl w:ilvl="8" w:tplc="20000005" w:tentative="1">
+      <w:start w:val="1"/>
+      <w:numFmt w:val="bullet"/>
+      <w:lvlText w:val=""/>
+      <w:lvlJc w:val="left"/>
+      <w:pPr>
+        <w:ind w:left="6480" w:hanging="360"/>
+      </w:pPr>
+      <w:rPr>
+        <w:rFonts w:ascii="Wingdings" w:hAnsi="Wingdings" w:hint="default"/>
+      </w:rPr>
+    </w:lvl>
+  </w:abstractNum>
+  <w:abstractNum w:abstractNumId="11" w15:restartNumberingAfterBreak="0">
+    <w:nsid w:val="68A96873"/>
+    <w:multiLevelType w:val="multilevel"/>
+    <w:tmpl w:val="800CBE2A"/>
+    <w:lvl w:ilvl="0">
+      <w:start w:val="1"/>
+      <w:numFmt w:val="bullet"/>
+      <w:lvlText w:val=""/>
+      <w:lvlJc w:val="left"/>
+      <w:pPr>
+        <w:tabs>
+          <w:tab w:val="num" w:pos="720"/>
+        </w:tabs>
+        <w:ind w:left="720" w:hanging="360"/>
+      </w:pPr>
+      <w:rPr>
+        <w:rFonts w:ascii="Symbol" w:hAnsi="Symbol" w:hint="default"/>
+        <w:sz w:val="20"/>
+      </w:rPr>
+    </w:lvl>
+    <w:lvl w:ilvl="1" w:tentative="1">
+      <w:start w:val="1"/>
+      <w:numFmt w:val="bullet"/>
+      <w:lvlText w:val="o"/>
+      <w:lvlJc w:val="left"/>
+      <w:pPr>
+        <w:tabs>
+          <w:tab w:val="num" w:pos="1440"/>
+        </w:tabs>
+        <w:ind w:left="1440" w:hanging="360"/>
+      </w:pPr>
+      <w:rPr>
+        <w:rFonts w:ascii="Courier New" w:hAnsi="Courier New" w:hint="default"/>
+        <w:sz w:val="20"/>
+      </w:rPr>
+    </w:lvl>
+    <w:lvl w:ilvl="2" w:tentative="1">
+      <w:start w:val="1"/>
+      <w:numFmt w:val="bullet"/>
+      <w:lvlText w:val=""/>
+      <w:lvlJc w:val="left"/>
+      <w:pPr>
+        <w:tabs>
+          <w:tab w:val="num" w:pos="2160"/>
+        </w:tabs>
+        <w:ind w:left="2160" w:hanging="360"/>
+      </w:pPr>
+      <w:rPr>
+        <w:rFonts w:ascii="Wingdings" w:hAnsi="Wingdings" w:hint="default"/>
+        <w:sz w:val="20"/>
+      </w:rPr>
+    </w:lvl>
+    <w:lvl w:ilvl="3" w:tentative="1">
+      <w:start w:val="1"/>
+      <w:numFmt w:val="bullet"/>
+      <w:lvlText w:val=""/>
+      <w:lvlJc w:val="left"/>
+      <w:pPr>
+        <w:tabs>
+          <w:tab w:val="num" w:pos="2880"/>
+        </w:tabs>
+        <w:ind w:left="2880" w:hanging="360"/>
+      </w:pPr>
+      <w:rPr>
+        <w:rFonts w:ascii="Wingdings" w:hAnsi="Wingdings" w:hint="default"/>
+        <w:sz w:val="20"/>
+      </w:rPr>
+    </w:lvl>
+    <w:lvl w:ilvl="4" w:tentative="1">
+      <w:start w:val="1"/>
+      <w:numFmt w:val="bullet"/>
+      <w:lvlText w:val=""/>
+      <w:lvlJc w:val="left"/>
+      <w:pPr>
+        <w:tabs>
+          <w:tab w:val="num" w:pos="3600"/>
+        </w:tabs>
+        <w:ind w:left="3600" w:hanging="360"/>
+      </w:pPr>
+      <w:rPr>
+        <w:rFonts w:ascii="Wingdings" w:hAnsi="Wingdings" w:hint="default"/>
+        <w:sz w:val="20"/>
+      </w:rPr>
+    </w:lvl>
+    <w:lvl w:ilvl="5" w:tentative="1">
+      <w:start w:val="1"/>
+      <w:numFmt w:val="bullet"/>
+      <w:lvlText w:val=""/>
+      <w:lvlJc w:val="left"/>
+      <w:pPr>
+        <w:tabs>
+          <w:tab w:val="num" w:pos="4320"/>
+        </w:tabs>
+        <w:ind w:left="4320" w:hanging="360"/>
+      </w:pPr>
+      <w:rPr>
+        <w:rFonts w:ascii="Wingdings" w:hAnsi="Wingdings" w:hint="default"/>
+        <w:sz w:val="20"/>
+      </w:rPr>
+    </w:lvl>
+    <w:lvl w:ilvl="6" w:tentative="1">
+      <w:start w:val="1"/>
+      <w:numFmt w:val="bullet"/>
+      <w:lvlText w:val=""/>
+      <w:lvlJc w:val="left"/>
+      <w:pPr>
+        <w:tabs>
+          <w:tab w:val="num" w:pos="5040"/>
+        </w:tabs>
+        <w:ind w:left="5040" w:hanging="360"/>
+      </w:pPr>
+      <w:rPr>
+        <w:rFonts w:ascii="Wingdings" w:hAnsi="Wingdings" w:hint="default"/>
+        <w:sz w:val="20"/>
+      </w:rPr>
+    </w:lvl>
+    <w:lvl w:ilvl="7" w:tentative="1">
+      <w:start w:val="1"/>
+      <w:numFmt w:val="bullet"/>
+      <w:lvlText w:val=""/>
+      <w:lvlJc w:val="left"/>
+      <w:pPr>
+        <w:tabs>
+          <w:tab w:val="num" w:pos="5760"/>
+        </w:tabs>
+        <w:ind w:left="5760" w:hanging="360"/>
+      </w:pPr>
+      <w:rPr>
+        <w:rFonts w:ascii="Wingdings" w:hAnsi="Wingdings" w:hint="default"/>
+        <w:sz w:val="20"/>
+      </w:rPr>
+    </w:lvl>
+    <w:lvl w:ilvl="8" w:tentative="1">
+      <w:start w:val="1"/>
+      <w:numFmt w:val="bullet"/>
+      <w:lvlText w:val=""/>
+      <w:lvlJc w:val="left"/>
+      <w:pPr>
+        <w:tabs>
+          <w:tab w:val="num" w:pos="6480"/>
+        </w:tabs>
+        <w:ind w:left="6480" w:hanging="360"/>
+      </w:pPr>
+      <w:rPr>
+        <w:rFonts w:ascii="Wingdings" w:hAnsi="Wingdings" w:hint="default"/>
+        <w:sz w:val="20"/>
+      </w:rPr>
+    </w:lvl>
+  </w:abstractNum>
   <w:num w:numId="1" w16cid:durableId="1520242149">
+    <w:abstractNumId w:val="1"/>
+  </w:num>
+  <w:num w:numId="2" w16cid:durableId="1786390027">
+    <w:abstractNumId w:val="11"/>
+  </w:num>
+  <w:num w:numId="3" w16cid:durableId="19208869">
     <w:abstractNumId w:val="0"/>
+  </w:num>
+  <w:num w:numId="4" w16cid:durableId="2047026906">
+    <w:abstractNumId w:val="6"/>
+  </w:num>
+  <w:num w:numId="5" w16cid:durableId="846939918">
+    <w:abstractNumId w:val="5"/>
+  </w:num>
+  <w:num w:numId="6" w16cid:durableId="553926937">
+    <w:abstractNumId w:val="8"/>
+  </w:num>
+  <w:num w:numId="7" w16cid:durableId="326591131">
+    <w:abstractNumId w:val="2"/>
+  </w:num>
+  <w:num w:numId="8" w16cid:durableId="1599174343">
+    <w:abstractNumId w:val="4"/>
+  </w:num>
+  <w:num w:numId="9" w16cid:durableId="1219122518">
+    <w:abstractNumId w:val="9"/>
+  </w:num>
+  <w:num w:numId="10" w16cid:durableId="1768187554">
+    <w:abstractNumId w:val="7"/>
+  </w:num>
+  <w:num w:numId="11" w16cid:durableId="872765959">
+    <w:abstractNumId w:val="3"/>
+  </w:num>
+  <w:num w:numId="12" w16cid:durableId="31811128">
+    <w:abstractNumId w:val="10"/>
   </w:num>
 </w:numbering>
 </file>
@@ -4025,7 +7286,6 @@
   <w:style w:type="character" w:default="1" w:styleId="a0">
     <w:name w:val="Default Paragraph Font"/>
     <w:uiPriority w:val="1"/>
-    <w:semiHidden/>
     <w:unhideWhenUsed/>
   </w:style>
   <w:style w:type="table" w:default="1" w:styleId="a1">

</xml_diff>